<commit_message>
PKSS KYRSACH v5 ?Done
</commit_message>
<xml_diff>
--- a/PKSS/_Курсовая работа.docx
+++ b/PKSS/_Курсовая работа.docx
@@ -1,6 +1,6 @@
 
 <file path=word/document.xml><?xml version="1.0" encoding="utf-8"?>
-<w:document xmlns:wpc="http://schemas.microsoft.com/office/word/2010/wordprocessingCanvas" xmlns:cx="http://schemas.microsoft.com/office/drawing/2014/chartex" xmlns:cx1="http://schemas.microsoft.com/office/drawing/2015/9/8/chartex" xmlns:cx2="http://schemas.microsoft.com/office/drawing/2015/10/21/chartex" xmlns:cx3="http://schemas.microsoft.com/office/drawing/2016/5/9/chartex" xmlns:cx4="http://schemas.microsoft.com/office/drawing/2016/5/10/chartex" xmlns:cx5="http://schemas.microsoft.com/office/drawing/2016/5/11/chartex" xmlns:cx6="http://schemas.microsoft.com/office/drawing/2016/5/12/chartex" xmlns:cx7="http://schemas.microsoft.com/office/drawing/2016/5/13/chartex" xmlns:cx8="http://schemas.microsoft.com/office/drawing/2016/5/14/chartex" xmlns:mc="http://schemas.openxmlformats.org/markup-compatibility/2006" xmlns:aink="http://schemas.microsoft.com/office/drawing/2016/ink" xmlns:am3d="http://schemas.microsoft.com/office/drawing/2017/model3d" xmlns:o="urn:schemas-microsoft-com:office:office" xmlns:oel="http://schemas.microsoft.com/office/2019/extlst" xmlns:r="http://schemas.openxmlformats.org/officeDocument/2006/relationships" xmlns:m="http://schemas.openxmlformats.org/officeDocument/2006/math" xmlns:v="urn:schemas-microsoft-com:vml" xmlns:wp14="http://schemas.microsoft.com/office/word/2010/wordprocessingDrawing" xmlns:wp="http://schemas.openxmlformats.org/drawingml/2006/wordprocessingDrawing" xmlns:w10="urn:schemas-microsoft-com:office:word" xmlns:w="http://schemas.openxmlformats.org/wordprocessingml/2006/main" xmlns:w14="http://schemas.microsoft.com/office/word/2010/wordml" xmlns:w15="http://schemas.microsoft.com/office/word/2012/wordml" xmlns:w16cex="http://schemas.microsoft.com/office/word/2018/wordml/cex" xmlns:w16cid="http://schemas.microsoft.com/office/word/2016/wordml/cid" xmlns:w16="http://schemas.microsoft.com/office/word/2018/wordml" xmlns:w16sdtdh="http://schemas.microsoft.com/office/word/2020/wordml/sdtdatahash" xmlns:w16se="http://schemas.microsoft.com/office/word/2015/wordml/symex" xmlns:wpg="http://schemas.microsoft.com/office/word/2010/wordprocessingGroup" xmlns:wpi="http://schemas.microsoft.com/office/word/2010/wordprocessingInk" xmlns:wne="http://schemas.microsoft.com/office/word/2006/wordml" xmlns:wps="http://schemas.microsoft.com/office/word/2010/wordprocessingShape" mc:Ignorable="w14 w15 w16se w16cid w16 w16cex w16sdtdh wp14">
+<w:document xmlns:wpc="http://schemas.microsoft.com/office/word/2010/wordprocessingCanvas" xmlns:cx="http://schemas.microsoft.com/office/drawing/2014/chartex" xmlns:cx1="http://schemas.microsoft.com/office/drawing/2015/9/8/chartex" xmlns:cx2="http://schemas.microsoft.com/office/drawing/2015/10/21/chartex" xmlns:cx3="http://schemas.microsoft.com/office/drawing/2016/5/9/chartex" xmlns:cx4="http://schemas.microsoft.com/office/drawing/2016/5/10/chartex" xmlns:cx5="http://schemas.microsoft.com/office/drawing/2016/5/11/chartex" xmlns:cx6="http://schemas.microsoft.com/office/drawing/2016/5/12/chartex" xmlns:cx7="http://schemas.microsoft.com/office/drawing/2016/5/13/chartex" xmlns:cx8="http://schemas.microsoft.com/office/drawing/2016/5/14/chartex" xmlns:mc="http://schemas.openxmlformats.org/markup-compatibility/2006" xmlns:aink="http://schemas.microsoft.com/office/drawing/2016/ink" xmlns:am3d="http://schemas.microsoft.com/office/drawing/2017/model3d" xmlns:o="urn:schemas-microsoft-com:office:office" xmlns:oel="http://schemas.microsoft.com/office/2019/extlst" xmlns:r="http://schemas.openxmlformats.org/officeDocument/2006/relationships" xmlns:m="http://schemas.openxmlformats.org/officeDocument/2006/math" xmlns:v="urn:schemas-microsoft-com:vml" xmlns:wp14="http://schemas.microsoft.com/office/word/2010/wordprocessingDrawing" xmlns:wp="http://schemas.openxmlformats.org/drawingml/2006/wordprocessingDrawing" xmlns:w10="urn:schemas-microsoft-com:office:word" xmlns:w="http://schemas.openxmlformats.org/wordprocessingml/2006/main" xmlns:w14="http://schemas.microsoft.com/office/word/2010/wordml" xmlns:w15="http://schemas.microsoft.com/office/word/2012/wordml" xmlns:w16cex="http://schemas.microsoft.com/office/word/2018/wordml/cex" xmlns:w16cid="http://schemas.microsoft.com/office/word/2016/wordml/cid" xmlns:w16="http://schemas.microsoft.com/office/word/2018/wordml" xmlns:w16du="http://schemas.microsoft.com/office/word/2023/wordml/word16du" xmlns:w16sdtdh="http://schemas.microsoft.com/office/word/2020/wordml/sdtdatahash" xmlns:w16sdtfl="http://schemas.microsoft.com/office/word/2024/wordml/sdtformatlock" xmlns:w16se="http://schemas.microsoft.com/office/word/2015/wordml/symex" xmlns:wpg="http://schemas.microsoft.com/office/word/2010/wordprocessingGroup" xmlns:wpi="http://schemas.microsoft.com/office/word/2010/wordprocessingInk" xmlns:wne="http://schemas.microsoft.com/office/word/2006/wordml" xmlns:wps="http://schemas.microsoft.com/office/word/2010/wordprocessingShape" mc:Ignorable="w14 w15 w16se w16cid w16 w16cex w16sdtdh w16sdtfl w16du wp14">
   <w:body>
     <w:sdt>
       <w:sdtPr>
@@ -3741,7 +3741,6 @@
         <w:tc>
           <w:tcPr>
             <w:tcW w:w="2860" w:type="dxa"/>
-            <w:shd w:val="clear" w:color="auto" w:fill="auto"/>
             <w:hideMark/>
           </w:tcPr>
           <w:p>
@@ -3770,7 +3769,6 @@
         <w:tc>
           <w:tcPr>
             <w:tcW w:w="2860" w:type="dxa"/>
-            <w:shd w:val="clear" w:color="auto" w:fill="auto"/>
             <w:hideMark/>
           </w:tcPr>
           <w:p>
@@ -3799,7 +3797,6 @@
         <w:tc>
           <w:tcPr>
             <w:tcW w:w="2860" w:type="dxa"/>
-            <w:shd w:val="clear" w:color="auto" w:fill="auto"/>
             <w:hideMark/>
           </w:tcPr>
           <w:p>
@@ -3836,7 +3833,6 @@
         <w:tc>
           <w:tcPr>
             <w:tcW w:w="2860" w:type="dxa"/>
-            <w:shd w:val="clear" w:color="auto" w:fill="auto"/>
             <w:hideMark/>
           </w:tcPr>
           <w:p>
@@ -3865,7 +3861,6 @@
         <w:tc>
           <w:tcPr>
             <w:tcW w:w="2860" w:type="dxa"/>
-            <w:shd w:val="clear" w:color="auto" w:fill="auto"/>
             <w:hideMark/>
           </w:tcPr>
           <w:p>
@@ -3894,7 +3889,6 @@
         <w:tc>
           <w:tcPr>
             <w:tcW w:w="2860" w:type="dxa"/>
-            <w:shd w:val="clear" w:color="auto" w:fill="auto"/>
             <w:hideMark/>
           </w:tcPr>
           <w:p>
@@ -3929,7 +3923,6 @@
         <w:tc>
           <w:tcPr>
             <w:tcW w:w="2860" w:type="dxa"/>
-            <w:shd w:val="clear" w:color="auto" w:fill="auto"/>
           </w:tcPr>
           <w:p>
             <w:pPr>
@@ -3957,7 +3950,6 @@
         <w:tc>
           <w:tcPr>
             <w:tcW w:w="2860" w:type="dxa"/>
-            <w:shd w:val="clear" w:color="auto" w:fill="auto"/>
           </w:tcPr>
           <w:p>
             <w:pPr>
@@ -3995,7 +3987,6 @@
         <w:tc>
           <w:tcPr>
             <w:tcW w:w="2860" w:type="dxa"/>
-            <w:shd w:val="clear" w:color="auto" w:fill="auto"/>
           </w:tcPr>
           <w:p>
             <w:pPr>
@@ -4039,7 +4030,6 @@
         <w:tc>
           <w:tcPr>
             <w:tcW w:w="2860" w:type="dxa"/>
-            <w:shd w:val="clear" w:color="auto" w:fill="auto"/>
           </w:tcPr>
           <w:p>
             <w:pPr>
@@ -4068,7 +4058,6 @@
         <w:tc>
           <w:tcPr>
             <w:tcW w:w="2860" w:type="dxa"/>
-            <w:shd w:val="clear" w:color="auto" w:fill="auto"/>
           </w:tcPr>
           <w:p>
             <w:pPr>
@@ -4106,7 +4095,6 @@
         <w:tc>
           <w:tcPr>
             <w:tcW w:w="2860" w:type="dxa"/>
-            <w:shd w:val="clear" w:color="auto" w:fill="auto"/>
           </w:tcPr>
           <w:p>
             <w:pPr>
@@ -4150,7 +4138,6 @@
         <w:tc>
           <w:tcPr>
             <w:tcW w:w="2860" w:type="dxa"/>
-            <w:shd w:val="clear" w:color="auto" w:fill="auto"/>
           </w:tcPr>
           <w:p>
             <w:pPr>
@@ -4178,7 +4165,6 @@
         <w:tc>
           <w:tcPr>
             <w:tcW w:w="2860" w:type="dxa"/>
-            <w:shd w:val="clear" w:color="auto" w:fill="auto"/>
           </w:tcPr>
           <w:p>
             <w:pPr>
@@ -4216,7 +4202,6 @@
         <w:tc>
           <w:tcPr>
             <w:tcW w:w="2860" w:type="dxa"/>
-            <w:shd w:val="clear" w:color="auto" w:fill="auto"/>
           </w:tcPr>
           <w:p>
             <w:pPr>
@@ -4438,7 +4423,6 @@
         <w:tc>
           <w:tcPr>
             <w:tcW w:w="2079" w:type="dxa"/>
-            <w:shd w:val="clear" w:color="auto" w:fill="auto"/>
             <w:hideMark/>
           </w:tcPr>
           <w:p>
@@ -4467,7 +4451,6 @@
         <w:tc>
           <w:tcPr>
             <w:tcW w:w="2612" w:type="dxa"/>
-            <w:shd w:val="clear" w:color="auto" w:fill="auto"/>
             <w:hideMark/>
           </w:tcPr>
           <w:p>
@@ -4496,7 +4479,6 @@
         <w:tc>
           <w:tcPr>
             <w:tcW w:w="2377" w:type="dxa"/>
-            <w:shd w:val="clear" w:color="auto" w:fill="auto"/>
             <w:hideMark/>
           </w:tcPr>
           <w:p>
@@ -4525,7 +4507,6 @@
         <w:tc>
           <w:tcPr>
             <w:tcW w:w="2612" w:type="dxa"/>
-            <w:shd w:val="clear" w:color="auto" w:fill="auto"/>
             <w:hideMark/>
           </w:tcPr>
           <w:p>
@@ -4560,7 +4541,6 @@
         <w:tc>
           <w:tcPr>
             <w:tcW w:w="2079" w:type="dxa"/>
-            <w:shd w:val="clear" w:color="auto" w:fill="auto"/>
             <w:hideMark/>
           </w:tcPr>
           <w:p>
@@ -4589,7 +4569,6 @@
         <w:tc>
           <w:tcPr>
             <w:tcW w:w="2612" w:type="dxa"/>
-            <w:shd w:val="clear" w:color="auto" w:fill="auto"/>
             <w:hideMark/>
           </w:tcPr>
           <w:p>
@@ -4618,7 +4597,6 @@
         <w:tc>
           <w:tcPr>
             <w:tcW w:w="2377" w:type="dxa"/>
-            <w:shd w:val="clear" w:color="auto" w:fill="auto"/>
             <w:hideMark/>
           </w:tcPr>
           <w:p>
@@ -4658,7 +4636,6 @@
         <w:tc>
           <w:tcPr>
             <w:tcW w:w="2612" w:type="dxa"/>
-            <w:shd w:val="clear" w:color="auto" w:fill="auto"/>
             <w:hideMark/>
           </w:tcPr>
           <w:p>
@@ -4694,7 +4671,6 @@
         <w:tc>
           <w:tcPr>
             <w:tcW w:w="2079" w:type="dxa"/>
-            <w:shd w:val="clear" w:color="auto" w:fill="auto"/>
             <w:hideMark/>
           </w:tcPr>
           <w:p>
@@ -4723,7 +4699,6 @@
         <w:tc>
           <w:tcPr>
             <w:tcW w:w="2612" w:type="dxa"/>
-            <w:shd w:val="clear" w:color="auto" w:fill="auto"/>
             <w:hideMark/>
           </w:tcPr>
           <w:p>
@@ -4752,7 +4727,6 @@
         <w:tc>
           <w:tcPr>
             <w:tcW w:w="2377" w:type="dxa"/>
-            <w:shd w:val="clear" w:color="auto" w:fill="auto"/>
             <w:hideMark/>
           </w:tcPr>
           <w:p>
@@ -4781,7 +4755,6 @@
         <w:tc>
           <w:tcPr>
             <w:tcW w:w="2612" w:type="dxa"/>
-            <w:shd w:val="clear" w:color="auto" w:fill="auto"/>
             <w:hideMark/>
           </w:tcPr>
           <w:p>
@@ -4816,7 +4789,6 @@
         <w:tc>
           <w:tcPr>
             <w:tcW w:w="2079" w:type="dxa"/>
-            <w:shd w:val="clear" w:color="auto" w:fill="auto"/>
             <w:hideMark/>
           </w:tcPr>
           <w:p>
@@ -4845,7 +4817,6 @@
         <w:tc>
           <w:tcPr>
             <w:tcW w:w="2612" w:type="dxa"/>
-            <w:shd w:val="clear" w:color="auto" w:fill="auto"/>
             <w:hideMark/>
           </w:tcPr>
           <w:p>
@@ -4874,7 +4845,6 @@
         <w:tc>
           <w:tcPr>
             <w:tcW w:w="2377" w:type="dxa"/>
-            <w:shd w:val="clear" w:color="auto" w:fill="auto"/>
             <w:hideMark/>
           </w:tcPr>
           <w:p>
@@ -4903,7 +4873,6 @@
         <w:tc>
           <w:tcPr>
             <w:tcW w:w="2612" w:type="dxa"/>
-            <w:shd w:val="clear" w:color="auto" w:fill="auto"/>
             <w:hideMark/>
           </w:tcPr>
           <w:p>
@@ -5327,7 +5296,23 @@
           <w:sz w:val="28"/>
           <w:szCs w:val="28"/>
         </w:rPr>
-        <w:t>Рисунок 2 – Диаграмма BPMN процесса завершения сезона (модель «КАК ЕСТЬ»)</w:t>
+        <w:t xml:space="preserve">Рисунок 2 – Диаграмма BPMN процесса </w:t>
+      </w:r>
+      <w:r>
+        <w:rPr>
+          <w:rFonts w:ascii="Times New Roman" w:hAnsi="Times New Roman" w:cs="Times New Roman"/>
+          <w:sz w:val="28"/>
+          <w:szCs w:val="28"/>
+        </w:rPr>
+        <w:t xml:space="preserve">покупка/обмен сезонного предмета </w:t>
+      </w:r>
+      <w:r>
+        <w:rPr>
+          <w:rFonts w:ascii="Times New Roman" w:hAnsi="Times New Roman" w:cs="Times New Roman"/>
+          <w:sz w:val="28"/>
+          <w:szCs w:val="28"/>
+        </w:rPr>
+        <w:t>(модель «КАК ЕСТЬ»)</w:t>
       </w:r>
     </w:p>
     <w:p>
@@ -5376,19 +5361,17 @@
         <w:jc w:val="both"/>
         <w:rPr>
           <w:rFonts w:ascii="Times New Roman" w:hAnsi="Times New Roman" w:cs="Times New Roman"/>
-          <w:color w:val="FF0000"/>
-          <w:sz w:val="28"/>
-          <w:szCs w:val="28"/>
-        </w:rPr>
-      </w:pPr>
-      <w:r>
-        <w:rPr>
-          <w:rFonts w:ascii="Times New Roman" w:hAnsi="Times New Roman" w:cs="Times New Roman"/>
-          <w:color w:val="FF0000"/>
-          <w:sz w:val="28"/>
-          <w:szCs w:val="28"/>
-        </w:rPr>
-        <w:t>Ручное или полуавтоматическое управление: ключевые операции, такие как запуск конвертации предметов или корректировка баланса, часто инициируются вручную разработчиком, что приводит к задержкам и человеческим ошибкам.</w:t>
+          <w:sz w:val="28"/>
+          <w:szCs w:val="28"/>
+        </w:rPr>
+      </w:pPr>
+      <w:r>
+        <w:rPr>
+          <w:rFonts w:ascii="Times New Roman" w:hAnsi="Times New Roman" w:cs="Times New Roman"/>
+          <w:sz w:val="28"/>
+          <w:szCs w:val="28"/>
+        </w:rPr>
+        <w:t>Непрозрачность для игрока: игроки не всегда имеют четкое представление о точном времени истечения срока действия предмета, а также о конкретных правилах его дальнейшей конвертации, что вызывает недовольство.</w:t>
       </w:r>
     </w:p>
     <w:p>
@@ -5403,19 +5386,17 @@
         <w:jc w:val="both"/>
         <w:rPr>
           <w:rFonts w:ascii="Times New Roman" w:hAnsi="Times New Roman" w:cs="Times New Roman"/>
-          <w:color w:val="FF0000"/>
-          <w:sz w:val="28"/>
-          <w:szCs w:val="28"/>
-        </w:rPr>
-      </w:pPr>
-      <w:r>
-        <w:rPr>
-          <w:rFonts w:ascii="Times New Roman" w:hAnsi="Times New Roman" w:cs="Times New Roman"/>
-          <w:color w:val="FF0000"/>
-          <w:sz w:val="28"/>
-          <w:szCs w:val="28"/>
-        </w:rPr>
-        <w:t>Непрозрачность для игрока: игроки не всегда имеют четкое представление о точном времени истечения срока действия предмета, а также о конкретных правилах его дальнейшей конвертации, что вызывает недовольство.</w:t>
+          <w:sz w:val="28"/>
+          <w:szCs w:val="28"/>
+        </w:rPr>
+      </w:pPr>
+      <w:r>
+        <w:rPr>
+          <w:rFonts w:ascii="Times New Roman" w:hAnsi="Times New Roman" w:cs="Times New Roman"/>
+          <w:sz w:val="28"/>
+          <w:szCs w:val="28"/>
+        </w:rPr>
+        <w:t>Отсутствие централизованного контроля за балансом: влияние изъятия или изменения сезонных предметов на общую игровую мету оценивается постфактум, а не является частью автоматизированного цикла.</w:t>
       </w:r>
     </w:p>
     <w:p>
@@ -5430,42 +5411,13 @@
         <w:jc w:val="both"/>
         <w:rPr>
           <w:rFonts w:ascii="Times New Roman" w:hAnsi="Times New Roman" w:cs="Times New Roman"/>
-          <w:color w:val="FF0000"/>
-          <w:sz w:val="28"/>
-          <w:szCs w:val="28"/>
-        </w:rPr>
-      </w:pPr>
-      <w:r>
-        <w:rPr>
-          <w:rFonts w:ascii="Times New Roman" w:hAnsi="Times New Roman" w:cs="Times New Roman"/>
-          <w:color w:val="FF0000"/>
-          <w:sz w:val="28"/>
-          <w:szCs w:val="28"/>
-        </w:rPr>
-        <w:t>Отсутствие централизованного контроля за балансом: влияние изъятия или изменения сезонных предметов на общую игровую мету оценивается постфактум, а не является частью автоматизированного цикла.</w:t>
-      </w:r>
-    </w:p>
-    <w:p>
-      <w:pPr>
-        <w:pStyle w:val="a7"/>
-        <w:numPr>
-          <w:ilvl w:val="0"/>
-          <w:numId w:val="39"/>
-        </w:numPr>
-        <w:spacing w:after="0" w:line="360" w:lineRule="auto"/>
-        <w:ind w:left="0" w:firstLine="709"/>
-        <w:jc w:val="both"/>
-        <w:rPr>
-          <w:rFonts w:ascii="Times New Roman" w:hAnsi="Times New Roman" w:cs="Times New Roman"/>
-          <w:color w:val="FF0000"/>
-          <w:sz w:val="28"/>
-          <w:szCs w:val="28"/>
-        </w:rPr>
-      </w:pPr>
-      <w:r>
-        <w:rPr>
-          <w:rFonts w:ascii="Times New Roman" w:hAnsi="Times New Roman" w:cs="Times New Roman"/>
-          <w:color w:val="FF0000"/>
+          <w:sz w:val="28"/>
+          <w:szCs w:val="28"/>
+        </w:rPr>
+      </w:pPr>
+      <w:r>
+        <w:rPr>
+          <w:rFonts w:ascii="Times New Roman" w:hAnsi="Times New Roman" w:cs="Times New Roman"/>
           <w:sz w:val="28"/>
           <w:szCs w:val="28"/>
         </w:rPr>
@@ -5480,29 +5432,17 @@
         <w:jc w:val="both"/>
         <w:rPr>
           <w:rFonts w:ascii="Times New Roman" w:hAnsi="Times New Roman" w:cs="Times New Roman"/>
-          <w:color w:val="FF0000"/>
-          <w:sz w:val="28"/>
-          <w:szCs w:val="28"/>
-        </w:rPr>
-      </w:pPr>
-      <w:r>
-        <w:rPr>
-          <w:rFonts w:ascii="Times New Roman" w:hAnsi="Times New Roman" w:cs="Times New Roman"/>
-          <w:color w:val="FF0000"/>
-          <w:sz w:val="28"/>
-          <w:szCs w:val="28"/>
-        </w:rPr>
-        <w:t xml:space="preserve">Для устранения выявленных недостатков текущего процесса необходимо усовершенствовать управление жизненным циклом. В системе должна быть реализована полностью автоматизированная обработка, управляемая конфигурируемыми правилами сезона. Это исключит задержки и ошибки ручного вмешательства. Также необходимо обеспечить полную прозрачность за счет предоставления игрокам в клиенте однозначной информации о статусе каждого предмета (таймер, условия конвертации). </w:t>
-      </w:r>
-      <w:r>
-        <w:rPr>
-          <w:rFonts w:ascii="Times New Roman" w:hAnsi="Times New Roman" w:cs="Times New Roman"/>
-          <w:color w:val="FF0000"/>
-          <w:sz w:val="28"/>
-          <w:szCs w:val="28"/>
-        </w:rPr>
-        <w:lastRenderedPageBreak/>
-        <w:t>Централизованная система правил позволит не только автоматически менять состояния предметов, но и предварительно оценивать потенциальное влияние их изменений на баланс. Наконец, все изменения должны фиксироваться в едином журнале аудита, что гарантирует согласованность данных и позволяет отследить любую операцию.</w:t>
+          <w:sz w:val="28"/>
+          <w:szCs w:val="28"/>
+        </w:rPr>
+      </w:pPr>
+      <w:r>
+        <w:rPr>
+          <w:rFonts w:ascii="Times New Roman" w:hAnsi="Times New Roman" w:cs="Times New Roman"/>
+          <w:sz w:val="28"/>
+          <w:szCs w:val="28"/>
+        </w:rPr>
+        <w:t>Для устранения выявленных недостатков текущего процесса необходимо усовершенствовать управление жизненным циклом. Также необходимо обеспечить полную прозрачность за счет предоставления игрокам в клиенте однозначной информации о статусе каждого предмета (таймер, условия конвертации).</w:t>
       </w:r>
     </w:p>
     <w:p>
@@ -5545,19 +5485,25 @@
         <w:jc w:val="both"/>
         <w:rPr>
           <w:rFonts w:ascii="Times New Roman" w:hAnsi="Times New Roman" w:cs="Times New Roman"/>
-          <w:color w:val="FF0000"/>
-          <w:sz w:val="28"/>
-          <w:szCs w:val="28"/>
-        </w:rPr>
-      </w:pPr>
-      <w:r>
-        <w:rPr>
-          <w:rFonts w:ascii="Times New Roman" w:hAnsi="Times New Roman" w:cs="Times New Roman"/>
-          <w:color w:val="FF0000"/>
-          <w:sz w:val="28"/>
-          <w:szCs w:val="28"/>
-        </w:rPr>
-        <w:t>С учётом выявленных недостатков модели «КАК ЕСТЬ» была разработана функциональная модель «КАК ДОЛЖНО БЫТЬ», отражающая оптимизированный процесс управления жизненным циклом сезонных предметов. Основными изменениями стали перенос всей критической логики контроля сроков и конвертации в централизованный сервис правил, что исключает влияние ошибок ручного вмешательства или задержек на целостность системы. Обеспечение идемпотентности всех операций изменения состояния предметов гарантирует, что каждая автоматическая конвертация или изъятие будет выполнено ровно один раз, даже в случае сбоев.</w:t>
+          <w:sz w:val="28"/>
+          <w:szCs w:val="28"/>
+        </w:rPr>
+      </w:pPr>
+      <w:r>
+        <w:rPr>
+          <w:rFonts w:ascii="Times New Roman" w:hAnsi="Times New Roman" w:cs="Times New Roman"/>
+          <w:sz w:val="28"/>
+          <w:szCs w:val="28"/>
+        </w:rPr>
+        <w:t>С учётом выявленных недостатков модели «КАК ЕСТЬ» была разработана функциональная модель «КАК ДОЛЖНО БЫТЬ</w:t>
+      </w:r>
+      <w:r>
+        <w:rPr>
+          <w:rFonts w:ascii="Times New Roman" w:hAnsi="Times New Roman" w:cs="Times New Roman"/>
+          <w:sz w:val="28"/>
+          <w:szCs w:val="28"/>
+        </w:rPr>
+        <w:t>.</w:t>
       </w:r>
     </w:p>
     <w:p>
@@ -5568,19 +5514,42 @@
         <w:jc w:val="both"/>
         <w:rPr>
           <w:rFonts w:ascii="Times New Roman" w:hAnsi="Times New Roman" w:cs="Times New Roman"/>
-          <w:color w:val="FF0000"/>
-          <w:sz w:val="28"/>
-          <w:szCs w:val="28"/>
-        </w:rPr>
-      </w:pPr>
-      <w:r>
-        <w:rPr>
-          <w:rFonts w:ascii="Times New Roman" w:hAnsi="Times New Roman" w:cs="Times New Roman"/>
-          <w:color w:val="FF0000"/>
-          <w:sz w:val="28"/>
-          <w:szCs w:val="28"/>
-        </w:rPr>
-        <w:t>Система стала модульной и масштабируемой: процессы проверки сроков, выполнения конвертации, оценки влияния на баланс и информирования игроков реализованы в виде независимых, слабосвязанных сервисов. Эти сервисы взаимодействуют через четко определенные API и управляются центральным оркестратором, который исполняет конфигурируемые правила сезонов. Это повышает отказоустойчивость, облегчает тестирование и позволяет гибко настраивать поведение системы под разные игровые проекты.</w:t>
+          <w:sz w:val="28"/>
+          <w:szCs w:val="28"/>
+        </w:rPr>
+      </w:pPr>
+      <w:r>
+        <w:rPr>
+          <w:rFonts w:ascii="Times New Roman" w:hAnsi="Times New Roman" w:cs="Times New Roman"/>
+          <w:sz w:val="28"/>
+          <w:szCs w:val="28"/>
+        </w:rPr>
+        <w:t xml:space="preserve">Система стала модульной и масштабируемой. </w:t>
+      </w:r>
+      <w:r>
+        <w:rPr>
+          <w:rFonts w:ascii="Times New Roman" w:hAnsi="Times New Roman" w:cs="Times New Roman"/>
+          <w:sz w:val="28"/>
+          <w:szCs w:val="28"/>
+        </w:rPr>
+        <w:t>Все</w:t>
+      </w:r>
+      <w:r>
+        <w:rPr>
+          <w:rFonts w:ascii="Times New Roman" w:hAnsi="Times New Roman" w:cs="Times New Roman"/>
+          <w:sz w:val="28"/>
+          <w:szCs w:val="28"/>
+        </w:rPr>
+        <w:t xml:space="preserve"> сервисы взаимодействуют через четко определенные API и управляются центральным оркестратором, который исполняет конфигурируемые правила сезонов. Это </w:t>
+      </w:r>
+      <w:r>
+        <w:rPr>
+          <w:rFonts w:ascii="Times New Roman" w:hAnsi="Times New Roman" w:cs="Times New Roman"/>
+          <w:sz w:val="28"/>
+          <w:szCs w:val="28"/>
+        </w:rPr>
+        <w:lastRenderedPageBreak/>
+        <w:t>повышает отказоустойчивость, облегчает тестирование и позволяет гибко настраивать поведение системы под разные игровые проекты.</w:t>
       </w:r>
     </w:p>
     <w:p>
@@ -5728,7 +5697,6 @@
         <w:rPr>
           <w:noProof/>
         </w:rPr>
-        <w:lastRenderedPageBreak/>
         <w:drawing>
           <wp:inline distT="0" distB="0" distL="0" distR="0" wp14:anchorId="14314840" wp14:editId="41AD7DAA">
             <wp:extent cx="3600000" cy="3387541"/>
@@ -10029,19 +9997,113 @@
         <w:jc w:val="both"/>
         <w:rPr>
           <w:rFonts w:ascii="Times New Roman" w:hAnsi="Times New Roman" w:cs="Times New Roman"/>
-          <w:color w:val="FF0000"/>
-          <w:sz w:val="28"/>
-          <w:szCs w:val="28"/>
-        </w:rPr>
-      </w:pPr>
-      <w:r>
-        <w:rPr>
-          <w:rFonts w:ascii="Times New Roman" w:hAnsi="Times New Roman" w:cs="Times New Roman"/>
-          <w:color w:val="FF0000"/>
-          <w:sz w:val="28"/>
-          <w:szCs w:val="28"/>
-        </w:rPr>
-        <w:t>Были построены диаграммы состояний, показывающие изменения состояния ключевых объектов системы: диаграмма состояния Сезонного Предмета отражает его жизненный цикл от создания и активации до истечения срока, конвертации или архивации; диаграмма состояния Сезона демонстрирует этапы от планирования и активной фазы до завершения и пост-обработки данных (рисунок 9–10).</w:t>
+          <w:sz w:val="28"/>
+          <w:szCs w:val="28"/>
+        </w:rPr>
+      </w:pPr>
+      <w:r>
+        <w:rPr>
+          <w:rFonts w:ascii="Times New Roman" w:hAnsi="Times New Roman" w:cs="Times New Roman"/>
+          <w:sz w:val="28"/>
+          <w:szCs w:val="28"/>
+        </w:rPr>
+        <w:t xml:space="preserve">Были построены диаграммы состояний, показывающие изменения состояния ключевых объектов системы: диаграмма состояния </w:t>
+      </w:r>
+      <w:r>
+        <w:rPr>
+          <w:rFonts w:ascii="Times New Roman" w:hAnsi="Times New Roman" w:cs="Times New Roman"/>
+          <w:sz w:val="28"/>
+          <w:szCs w:val="28"/>
+        </w:rPr>
+        <w:t>Клиента отражает</w:t>
+      </w:r>
+      <w:r>
+        <w:rPr>
+          <w:rFonts w:ascii="Times New Roman" w:hAnsi="Times New Roman" w:cs="Times New Roman"/>
+          <w:sz w:val="28"/>
+          <w:szCs w:val="28"/>
+        </w:rPr>
+        <w:t xml:space="preserve"> его жизненный цикл от создания и активации до </w:t>
+      </w:r>
+      <w:r>
+        <w:rPr>
+          <w:rFonts w:ascii="Times New Roman" w:hAnsi="Times New Roman" w:cs="Times New Roman"/>
+          <w:sz w:val="28"/>
+          <w:szCs w:val="28"/>
+        </w:rPr>
+        <w:t>выхода или переподключения</w:t>
+      </w:r>
+      <w:r>
+        <w:rPr>
+          <w:rFonts w:ascii="Times New Roman" w:hAnsi="Times New Roman" w:cs="Times New Roman"/>
+          <w:sz w:val="28"/>
+          <w:szCs w:val="28"/>
+        </w:rPr>
+        <w:t xml:space="preserve">; диаграмма состояния </w:t>
+      </w:r>
+      <w:r>
+        <w:rPr>
+          <w:rFonts w:ascii="Times New Roman" w:hAnsi="Times New Roman" w:cs="Times New Roman"/>
+          <w:sz w:val="28"/>
+          <w:szCs w:val="28"/>
+        </w:rPr>
+        <w:t>Сессии</w:t>
+      </w:r>
+      <w:r>
+        <w:rPr>
+          <w:rFonts w:ascii="Times New Roman" w:hAnsi="Times New Roman" w:cs="Times New Roman"/>
+          <w:sz w:val="28"/>
+          <w:szCs w:val="28"/>
+        </w:rPr>
+        <w:t xml:space="preserve"> демонстрирует этапы от </w:t>
+      </w:r>
+      <w:r>
+        <w:rPr>
+          <w:rFonts w:ascii="Times New Roman" w:hAnsi="Times New Roman" w:cs="Times New Roman"/>
+          <w:sz w:val="28"/>
+          <w:szCs w:val="28"/>
+        </w:rPr>
+        <w:t>создания</w:t>
+      </w:r>
+      <w:r>
+        <w:rPr>
+          <w:rFonts w:ascii="Times New Roman" w:hAnsi="Times New Roman" w:cs="Times New Roman"/>
+          <w:sz w:val="28"/>
+          <w:szCs w:val="28"/>
+        </w:rPr>
+        <w:t xml:space="preserve"> до </w:t>
+      </w:r>
+      <w:r>
+        <w:rPr>
+          <w:rFonts w:ascii="Times New Roman" w:hAnsi="Times New Roman" w:cs="Times New Roman"/>
+          <w:sz w:val="28"/>
+          <w:szCs w:val="28"/>
+        </w:rPr>
+        <w:t>удаления</w:t>
+      </w:r>
+      <w:r>
+        <w:rPr>
+          <w:rFonts w:ascii="Times New Roman" w:hAnsi="Times New Roman" w:cs="Times New Roman"/>
+          <w:sz w:val="28"/>
+          <w:szCs w:val="28"/>
+        </w:rPr>
+        <w:t xml:space="preserve"> </w:t>
+      </w:r>
+      <w:r>
+        <w:rPr>
+          <w:rFonts w:ascii="Times New Roman" w:hAnsi="Times New Roman" w:cs="Times New Roman"/>
+          <w:sz w:val="28"/>
+          <w:szCs w:val="28"/>
+        </w:rPr>
+        <w:t xml:space="preserve">сервера </w:t>
+      </w:r>
+      <w:r>
+        <w:rPr>
+          <w:rFonts w:ascii="Times New Roman" w:hAnsi="Times New Roman" w:cs="Times New Roman"/>
+          <w:sz w:val="28"/>
+          <w:szCs w:val="28"/>
+        </w:rPr>
+        <w:t>(рисунок 9–10).</w:t>
       </w:r>
     </w:p>
     <w:p>
@@ -10049,10 +10111,9 @@
         <w:pStyle w:val="a7"/>
         <w:spacing w:after="0" w:line="360" w:lineRule="auto"/>
         <w:ind w:left="0" w:firstLine="709"/>
-        <w:jc w:val="both"/>
-        <w:rPr>
-          <w:rFonts w:ascii="Times New Roman" w:hAnsi="Times New Roman" w:cs="Times New Roman"/>
-          <w:color w:val="FF0000"/>
+        <w:jc w:val="center"/>
+        <w:rPr>
+          <w:rFonts w:ascii="Times New Roman" w:hAnsi="Times New Roman" w:cs="Times New Roman"/>
           <w:sz w:val="28"/>
           <w:szCs w:val="28"/>
         </w:rPr>
@@ -10133,7 +10194,6 @@
       <w:r>
         <w:rPr>
           <w:rFonts w:ascii="Times New Roman" w:hAnsi="Times New Roman" w:cs="Times New Roman"/>
-          <w:color w:val="FF0000"/>
           <w:sz w:val="28"/>
           <w:szCs w:val="28"/>
         </w:rPr>
@@ -10156,7 +10216,6 @@
         <w:jc w:val="both"/>
         <w:rPr>
           <w:rFonts w:ascii="Times New Roman" w:hAnsi="Times New Roman" w:cs="Times New Roman"/>
-          <w:color w:val="FF0000"/>
           <w:sz w:val="28"/>
           <w:szCs w:val="28"/>
         </w:rPr>
@@ -10167,10 +10226,9 @@
         <w:pStyle w:val="a7"/>
         <w:spacing w:after="0" w:line="360" w:lineRule="auto"/>
         <w:ind w:left="0" w:firstLine="709"/>
-        <w:jc w:val="both"/>
-        <w:rPr>
-          <w:rFonts w:ascii="Times New Roman" w:hAnsi="Times New Roman" w:cs="Times New Roman"/>
-          <w:color w:val="FF0000"/>
+        <w:jc w:val="center"/>
+        <w:rPr>
+          <w:rFonts w:ascii="Times New Roman" w:hAnsi="Times New Roman" w:cs="Times New Roman"/>
           <w:sz w:val="28"/>
           <w:szCs w:val="28"/>
         </w:rPr>
@@ -10243,18 +10301,16 @@
         <w:pStyle w:val="a7"/>
         <w:spacing w:after="0" w:line="360" w:lineRule="auto"/>
         <w:ind w:left="0" w:firstLine="709"/>
-        <w:jc w:val="both"/>
-        <w:rPr>
-          <w:rFonts w:ascii="Times New Roman" w:hAnsi="Times New Roman" w:cs="Times New Roman"/>
-          <w:color w:val="FF0000"/>
-          <w:sz w:val="28"/>
-          <w:szCs w:val="28"/>
-        </w:rPr>
-      </w:pPr>
-      <w:r>
-        <w:rPr>
-          <w:rFonts w:ascii="Times New Roman" w:hAnsi="Times New Roman" w:cs="Times New Roman"/>
-          <w:color w:val="FF0000"/>
+        <w:jc w:val="center"/>
+        <w:rPr>
+          <w:rFonts w:ascii="Times New Roman" w:hAnsi="Times New Roman" w:cs="Times New Roman"/>
+          <w:sz w:val="28"/>
+          <w:szCs w:val="28"/>
+        </w:rPr>
+      </w:pPr>
+      <w:r>
+        <w:rPr>
+          <w:rFonts w:ascii="Times New Roman" w:hAnsi="Times New Roman" w:cs="Times New Roman"/>
           <w:sz w:val="28"/>
           <w:szCs w:val="28"/>
         </w:rPr>
@@ -10266,15 +10322,7 @@
           <w:sz w:val="28"/>
           <w:szCs w:val="28"/>
         </w:rPr>
-        <w:t>Сессия</w:t>
-      </w:r>
-      <w:r>
-        <w:rPr>
-          <w:rFonts w:ascii="Times New Roman" w:hAnsi="Times New Roman" w:cs="Times New Roman"/>
-          <w:sz w:val="28"/>
-          <w:szCs w:val="28"/>
-        </w:rPr>
-        <w:t xml:space="preserve"> / </w:t>
+        <w:t xml:space="preserve">Сессия / </w:t>
       </w:r>
       <w:r>
         <w:rPr>
@@ -10294,15 +10342,13 @@
         <w:jc w:val="both"/>
         <w:rPr>
           <w:rFonts w:ascii="Times New Roman" w:hAnsi="Times New Roman" w:cs="Times New Roman"/>
-          <w:color w:val="FF0000"/>
-          <w:sz w:val="28"/>
-          <w:szCs w:val="28"/>
-        </w:rPr>
-      </w:pPr>
-      <w:r>
-        <w:rPr>
-          <w:rFonts w:ascii="Times New Roman" w:hAnsi="Times New Roman" w:cs="Times New Roman"/>
-          <w:color w:val="FF0000"/>
+          <w:sz w:val="28"/>
+          <w:szCs w:val="28"/>
+        </w:rPr>
+      </w:pPr>
+      <w:r>
+        <w:rPr>
+          <w:rFonts w:ascii="Times New Roman" w:hAnsi="Times New Roman" w:cs="Times New Roman"/>
           <w:sz w:val="28"/>
           <w:szCs w:val="28"/>
         </w:rPr>
@@ -10317,11 +10363,92 @@
         <w:jc w:val="both"/>
         <w:rPr>
           <w:rFonts w:ascii="Times New Roman" w:hAnsi="Times New Roman" w:cs="Times New Roman"/>
-          <w:color w:val="FF0000"/>
-          <w:sz w:val="28"/>
-          <w:szCs w:val="28"/>
-        </w:rPr>
-      </w:pPr>
+          <w:sz w:val="28"/>
+          <w:szCs w:val="28"/>
+        </w:rPr>
+      </w:pPr>
+      <w:proofErr w:type="spellStart"/>
+      <w:r>
+        <w:rPr>
+          <w:rFonts w:ascii="Times New Roman" w:hAnsi="Times New Roman" w:cs="Times New Roman"/>
+          <w:sz w:val="28"/>
+          <w:szCs w:val="28"/>
+        </w:rPr>
+        <w:t>Sequence</w:t>
+      </w:r>
+      <w:proofErr w:type="spellEnd"/>
+      <w:r>
+        <w:rPr>
+          <w:rFonts w:ascii="Times New Roman" w:hAnsi="Times New Roman" w:cs="Times New Roman"/>
+          <w:sz w:val="28"/>
+          <w:szCs w:val="28"/>
+        </w:rPr>
+        <w:t xml:space="preserve">-диаграмма </w:t>
+      </w:r>
+      <w:r>
+        <w:rPr>
+          <w:rFonts w:ascii="Times New Roman" w:hAnsi="Times New Roman" w:cs="Times New Roman"/>
+          <w:sz w:val="28"/>
+          <w:szCs w:val="28"/>
+        </w:rPr>
+        <w:t>«</w:t>
+      </w:r>
+      <w:r>
+        <w:rPr>
+          <w:rFonts w:ascii="Times New Roman" w:hAnsi="Times New Roman" w:cs="Times New Roman"/>
+          <w:sz w:val="28"/>
+          <w:szCs w:val="28"/>
+        </w:rPr>
+        <w:t xml:space="preserve">Входа/Обновление </w:t>
+      </w:r>
+      <w:r>
+        <w:rPr>
+          <w:rFonts w:ascii="Times New Roman" w:hAnsi="Times New Roman" w:cs="Times New Roman"/>
+          <w:sz w:val="28"/>
+          <w:szCs w:val="28"/>
+        </w:rPr>
+        <w:t>доступа» демонстрирует</w:t>
+      </w:r>
+      <w:r>
+        <w:rPr>
+          <w:rFonts w:ascii="Times New Roman" w:hAnsi="Times New Roman" w:cs="Times New Roman"/>
+          <w:sz w:val="28"/>
+          <w:szCs w:val="28"/>
+        </w:rPr>
+        <w:t xml:space="preserve"> взаимодействие </w:t>
+      </w:r>
+      <w:r>
+        <w:rPr>
+          <w:rFonts w:ascii="Times New Roman" w:hAnsi="Times New Roman" w:cs="Times New Roman"/>
+          <w:sz w:val="28"/>
+          <w:szCs w:val="28"/>
+        </w:rPr>
+        <w:t xml:space="preserve">происходящие </w:t>
+      </w:r>
+      <w:r>
+        <w:rPr>
+          <w:rFonts w:ascii="Times New Roman" w:hAnsi="Times New Roman" w:cs="Times New Roman"/>
+          <w:sz w:val="28"/>
+          <w:szCs w:val="28"/>
+        </w:rPr>
+        <w:t>при обработке</w:t>
+      </w:r>
+      <w:r>
+        <w:rPr>
+          <w:rFonts w:ascii="Times New Roman" w:hAnsi="Times New Roman" w:cs="Times New Roman"/>
+          <w:sz w:val="28"/>
+          <w:szCs w:val="28"/>
+        </w:rPr>
+        <w:t xml:space="preserve"> входа пользователя в систему</w:t>
+      </w:r>
+      <w:r>
+        <w:rPr>
+          <w:rFonts w:ascii="Times New Roman" w:hAnsi="Times New Roman" w:cs="Times New Roman"/>
+          <w:sz w:val="28"/>
+          <w:szCs w:val="28"/>
+        </w:rPr>
+        <w:t>.</w:t>
+      </w:r>
     </w:p>
     <w:p>
       <w:pPr>
@@ -10331,7 +10458,6 @@
         <w:jc w:val="both"/>
         <w:rPr>
           <w:rFonts w:ascii="Times New Roman" w:hAnsi="Times New Roman" w:cs="Times New Roman"/>
-          <w:color w:val="FF0000"/>
           <w:sz w:val="28"/>
           <w:szCs w:val="28"/>
         </w:rPr>
@@ -10340,7 +10466,6 @@
       <w:r>
         <w:rPr>
           <w:rFonts w:ascii="Times New Roman" w:hAnsi="Times New Roman" w:cs="Times New Roman"/>
-          <w:color w:val="FF0000"/>
           <w:sz w:val="28"/>
           <w:szCs w:val="28"/>
         </w:rPr>
@@ -10350,11 +10475,90 @@
       <w:r>
         <w:rPr>
           <w:rFonts w:ascii="Times New Roman" w:hAnsi="Times New Roman" w:cs="Times New Roman"/>
-          <w:color w:val="FF0000"/>
-          <w:sz w:val="28"/>
-          <w:szCs w:val="28"/>
-        </w:rPr>
-        <w:t>-диаграмма завершения сезона и массовой конвертации предметов демонстрирует взаимодействие сервиса таймеров, движка правил, базы данных и сервиса уведомлений при обработке окончания сезонного периода.</w:t>
+          <w:sz w:val="28"/>
+          <w:szCs w:val="28"/>
+        </w:rPr>
+        <w:t xml:space="preserve">-диаграмма </w:t>
+      </w:r>
+      <w:r>
+        <w:rPr>
+          <w:rFonts w:ascii="Times New Roman" w:hAnsi="Times New Roman" w:cs="Times New Roman"/>
+          <w:sz w:val="28"/>
+          <w:szCs w:val="28"/>
+        </w:rPr>
+        <w:t>«П</w:t>
+      </w:r>
+      <w:r>
+        <w:rPr>
+          <w:rFonts w:ascii="Times New Roman" w:hAnsi="Times New Roman" w:cs="Times New Roman"/>
+          <w:sz w:val="28"/>
+          <w:szCs w:val="28"/>
+        </w:rPr>
+        <w:t>окупки сезонного предмета</w:t>
+      </w:r>
+      <w:r>
+        <w:rPr>
+          <w:rFonts w:ascii="Times New Roman" w:hAnsi="Times New Roman" w:cs="Times New Roman"/>
+          <w:sz w:val="28"/>
+          <w:szCs w:val="28"/>
+        </w:rPr>
+        <w:t>»</w:t>
+      </w:r>
+      <w:r>
+        <w:rPr>
+          <w:rFonts w:ascii="Times New Roman" w:hAnsi="Times New Roman" w:cs="Times New Roman"/>
+          <w:sz w:val="28"/>
+          <w:szCs w:val="28"/>
+        </w:rPr>
+        <w:t xml:space="preserve"> показывает процесс </w:t>
+      </w:r>
+      <w:r>
+        <w:rPr>
+          <w:rFonts w:ascii="Times New Roman" w:hAnsi="Times New Roman" w:cs="Times New Roman"/>
+          <w:sz w:val="28"/>
+          <w:szCs w:val="28"/>
+        </w:rPr>
+        <w:t>покупки</w:t>
+      </w:r>
+      <w:r>
+        <w:rPr>
+          <w:rFonts w:ascii="Times New Roman" w:hAnsi="Times New Roman" w:cs="Times New Roman"/>
+          <w:sz w:val="28"/>
+          <w:szCs w:val="28"/>
+        </w:rPr>
+        <w:t xml:space="preserve"> </w:t>
+      </w:r>
+      <w:r>
+        <w:rPr>
+          <w:rFonts w:ascii="Times New Roman" w:hAnsi="Times New Roman" w:cs="Times New Roman"/>
+          <w:sz w:val="28"/>
+          <w:szCs w:val="28"/>
+        </w:rPr>
+        <w:t xml:space="preserve">выбранного пользователем </w:t>
+      </w:r>
+      <w:r>
+        <w:rPr>
+          <w:rFonts w:ascii="Times New Roman" w:hAnsi="Times New Roman" w:cs="Times New Roman"/>
+          <w:sz w:val="28"/>
+          <w:szCs w:val="28"/>
+        </w:rPr>
+        <w:t>предмета, выполнения операции и фиксации результата</w:t>
+      </w:r>
+      <w:r>
+        <w:rPr>
+          <w:rFonts w:ascii="Times New Roman" w:hAnsi="Times New Roman" w:cs="Times New Roman"/>
+          <w:sz w:val="28"/>
+          <w:szCs w:val="28"/>
+        </w:rPr>
+        <w:t xml:space="preserve"> в аналитике</w:t>
+      </w:r>
+      <w:r>
+        <w:rPr>
+          <w:rFonts w:ascii="Times New Roman" w:hAnsi="Times New Roman" w:cs="Times New Roman"/>
+          <w:sz w:val="28"/>
+          <w:szCs w:val="28"/>
+        </w:rPr>
+        <w:t>.</w:t>
       </w:r>
     </w:p>
     <w:p>
@@ -10365,21 +10569,6 @@
         <w:jc w:val="both"/>
         <w:rPr>
           <w:rFonts w:ascii="Times New Roman" w:hAnsi="Times New Roman" w:cs="Times New Roman"/>
-          <w:color w:val="FF0000"/>
-          <w:sz w:val="28"/>
-          <w:szCs w:val="28"/>
-        </w:rPr>
-      </w:pPr>
-    </w:p>
-    <w:p>
-      <w:pPr>
-        <w:pStyle w:val="a7"/>
-        <w:spacing w:after="0" w:line="360" w:lineRule="auto"/>
-        <w:ind w:left="0" w:firstLine="709"/>
-        <w:jc w:val="both"/>
-        <w:rPr>
-          <w:rFonts w:ascii="Times New Roman" w:hAnsi="Times New Roman" w:cs="Times New Roman"/>
-          <w:color w:val="FF0000"/>
           <w:sz w:val="28"/>
           <w:szCs w:val="28"/>
         </w:rPr>
@@ -10388,7 +10577,6 @@
       <w:r>
         <w:rPr>
           <w:rFonts w:ascii="Times New Roman" w:hAnsi="Times New Roman" w:cs="Times New Roman"/>
-          <w:color w:val="FF0000"/>
           <w:sz w:val="28"/>
           <w:szCs w:val="28"/>
         </w:rPr>
@@ -10398,89 +10586,58 @@
       <w:r>
         <w:rPr>
           <w:rFonts w:ascii="Times New Roman" w:hAnsi="Times New Roman" w:cs="Times New Roman"/>
-          <w:color w:val="FF0000"/>
-          <w:sz w:val="28"/>
-          <w:szCs w:val="28"/>
-        </w:rPr>
-        <w:t>-диаграмма проверки и применения правил к единичному предмету показывает процесс запроса текущего состояния предмета, выбора подходящего правила конвертации, выполнения операции и фиксации результата.</w:t>
-      </w:r>
-    </w:p>
-    <w:p>
-      <w:pPr>
-        <w:pStyle w:val="a7"/>
-        <w:spacing w:after="0" w:line="360" w:lineRule="auto"/>
-        <w:ind w:left="0" w:firstLine="709"/>
-        <w:jc w:val="both"/>
-        <w:rPr>
-          <w:rFonts w:ascii="Times New Roman" w:hAnsi="Times New Roman" w:cs="Times New Roman"/>
-          <w:color w:val="FF0000"/>
-          <w:sz w:val="28"/>
-          <w:szCs w:val="28"/>
-        </w:rPr>
-      </w:pPr>
-    </w:p>
-    <w:p>
-      <w:pPr>
-        <w:pStyle w:val="a7"/>
-        <w:spacing w:after="0" w:line="360" w:lineRule="auto"/>
-        <w:ind w:left="0" w:firstLine="709"/>
-        <w:jc w:val="both"/>
-        <w:rPr>
-          <w:rFonts w:ascii="Times New Roman" w:hAnsi="Times New Roman" w:cs="Times New Roman"/>
-          <w:color w:val="FF0000"/>
-          <w:sz w:val="28"/>
-          <w:szCs w:val="28"/>
-        </w:rPr>
-      </w:pPr>
-      <w:proofErr w:type="spellStart"/>
-      <w:r>
-        <w:rPr>
-          <w:rFonts w:ascii="Times New Roman" w:hAnsi="Times New Roman" w:cs="Times New Roman"/>
-          <w:color w:val="FF0000"/>
-          <w:sz w:val="28"/>
-          <w:szCs w:val="28"/>
-        </w:rPr>
-        <w:t>Sequence</w:t>
-      </w:r>
-      <w:proofErr w:type="spellEnd"/>
-      <w:r>
-        <w:rPr>
-          <w:rFonts w:ascii="Times New Roman" w:hAnsi="Times New Roman" w:cs="Times New Roman"/>
-          <w:color w:val="FF0000"/>
-          <w:sz w:val="28"/>
-          <w:szCs w:val="28"/>
-        </w:rPr>
-        <w:t xml:space="preserve"> </w:t>
-      </w:r>
-      <w:proofErr w:type="spellStart"/>
-      <w:r>
-        <w:rPr>
-          <w:rFonts w:ascii="Times New Roman" w:hAnsi="Times New Roman" w:cs="Times New Roman"/>
-          <w:color w:val="FF0000"/>
-          <w:sz w:val="28"/>
-          <w:szCs w:val="28"/>
-        </w:rPr>
-        <w:t>Diagram</w:t>
-      </w:r>
-      <w:proofErr w:type="spellEnd"/>
-      <w:r>
-        <w:rPr>
-          <w:rFonts w:ascii="Times New Roman" w:hAnsi="Times New Roman" w:cs="Times New Roman"/>
-          <w:color w:val="FF0000"/>
-          <w:sz w:val="28"/>
-          <w:szCs w:val="28"/>
-        </w:rPr>
-        <w:t xml:space="preserve"> «Полный цикл предмета» иллюстрирует сквозное взаимодействие всех участников и систем — от создания правила </w:t>
-      </w:r>
-      <w:r>
-        <w:rPr>
-          <w:rFonts w:ascii="Times New Roman" w:hAnsi="Times New Roman" w:cs="Times New Roman"/>
-          <w:color w:val="FF0000"/>
-          <w:sz w:val="28"/>
-          <w:szCs w:val="28"/>
-        </w:rPr>
-        <w:lastRenderedPageBreak/>
-        <w:t>конфигурации администратором и получения предмета игроком до его автоматической конвертации и отправки итогового уведомления (рисунок 11–13).</w:t>
+          <w:sz w:val="28"/>
+          <w:szCs w:val="28"/>
+        </w:rPr>
+        <w:t xml:space="preserve">-диаграмма </w:t>
+      </w:r>
+      <w:r>
+        <w:rPr>
+          <w:rFonts w:ascii="Times New Roman" w:hAnsi="Times New Roman" w:cs="Times New Roman"/>
+          <w:sz w:val="28"/>
+          <w:szCs w:val="28"/>
+        </w:rPr>
+        <w:t>«</w:t>
+      </w:r>
+      <w:r>
+        <w:rPr>
+          <w:rFonts w:ascii="Times New Roman" w:hAnsi="Times New Roman" w:cs="Times New Roman"/>
+          <w:sz w:val="28"/>
+          <w:szCs w:val="28"/>
+        </w:rPr>
+        <w:t>О</w:t>
+      </w:r>
+      <w:r>
+        <w:rPr>
+          <w:rFonts w:ascii="Times New Roman" w:hAnsi="Times New Roman" w:cs="Times New Roman"/>
+          <w:sz w:val="28"/>
+          <w:szCs w:val="28"/>
+        </w:rPr>
+        <w:t>бмена/окончания действия сезонного предмета</w:t>
+      </w:r>
+      <w:r>
+        <w:rPr>
+          <w:rFonts w:ascii="Times New Roman" w:hAnsi="Times New Roman" w:cs="Times New Roman"/>
+          <w:sz w:val="28"/>
+          <w:szCs w:val="28"/>
+        </w:rPr>
+        <w:t xml:space="preserve">» иллюстрирует взаимодействие всех систем — от </w:t>
+      </w:r>
+      <w:r>
+        <w:rPr>
+          <w:rFonts w:ascii="Times New Roman" w:hAnsi="Times New Roman" w:cs="Times New Roman"/>
+          <w:sz w:val="28"/>
+          <w:szCs w:val="28"/>
+        </w:rPr>
+        <w:t>запроса проверки сроков действия предметов</w:t>
+      </w:r>
+      <w:r>
+        <w:rPr>
+          <w:rFonts w:ascii="Times New Roman" w:hAnsi="Times New Roman" w:cs="Times New Roman"/>
+          <w:sz w:val="28"/>
+          <w:szCs w:val="28"/>
+        </w:rPr>
+        <w:t xml:space="preserve"> до его автоматической конвертации и отправки итогового уведомления (рисунок 11–13).</w:t>
       </w:r>
     </w:p>
     <w:p>
@@ -10503,6 +10660,7 @@
           <w:szCs w:val="28"/>
           <w:lang w:val="en-US"/>
         </w:rPr>
+        <w:lastRenderedPageBreak/>
         <w:drawing>
           <wp:inline distT="0" distB="0" distL="0" distR="0" wp14:anchorId="5C173A5E" wp14:editId="022710E7">
             <wp:extent cx="5400000" cy="3640449"/>
@@ -10792,7 +10950,6 @@
           <w:rFonts w:ascii="Times New Roman" w:hAnsi="Times New Roman" w:cs="Times New Roman"/>
           <w:sz w:val="28"/>
           <w:szCs w:val="28"/>
-          <w:lang w:val="en-US"/>
         </w:rPr>
       </w:pPr>
       <w:r>
@@ -10821,7 +10978,6 @@
           <w:rFonts w:ascii="Times New Roman" w:hAnsi="Times New Roman" w:cs="Times New Roman"/>
           <w:sz w:val="28"/>
           <w:szCs w:val="28"/>
-          <w:lang w:val="en-US"/>
         </w:rPr>
       </w:pPr>
     </w:p>
@@ -11056,15 +11212,13 @@
         <w:jc w:val="both"/>
         <w:rPr>
           <w:rFonts w:ascii="Times New Roman" w:hAnsi="Times New Roman" w:cs="Times New Roman"/>
-          <w:color w:val="FF0000"/>
-          <w:sz w:val="28"/>
-          <w:szCs w:val="28"/>
-        </w:rPr>
-      </w:pPr>
-      <w:r>
-        <w:rPr>
-          <w:rFonts w:ascii="Times New Roman" w:hAnsi="Times New Roman" w:cs="Times New Roman"/>
-          <w:color w:val="FF0000"/>
+          <w:sz w:val="28"/>
+          <w:szCs w:val="28"/>
+        </w:rPr>
+      </w:pPr>
+      <w:r>
+        <w:rPr>
+          <w:rFonts w:ascii="Times New Roman" w:hAnsi="Times New Roman" w:cs="Times New Roman"/>
           <w:sz w:val="28"/>
           <w:szCs w:val="28"/>
         </w:rPr>
@@ -11073,7 +11227,6 @@
       <w:r>
         <w:rPr>
           <w:rFonts w:ascii="Times New Roman" w:hAnsi="Times New Roman" w:cs="Times New Roman"/>
-          <w:color w:val="FF0000"/>
           <w:sz w:val="28"/>
           <w:szCs w:val="28"/>
         </w:rPr>
@@ -11082,61 +11235,51 @@
       <w:r>
         <w:rPr>
           <w:rFonts w:ascii="Times New Roman" w:hAnsi="Times New Roman" w:cs="Times New Roman"/>
-          <w:color w:val="FF0000"/>
-          <w:sz w:val="28"/>
-          <w:szCs w:val="28"/>
-        </w:rPr>
-        <w:t xml:space="preserve"> архитектуре, что обеспечивает высокую гибкость, </w:t>
-      </w:r>
-      <w:proofErr w:type="spellStart"/>
-      <w:r>
-        <w:rPr>
-          <w:rFonts w:ascii="Times New Roman" w:hAnsi="Times New Roman" w:cs="Times New Roman"/>
-          <w:color w:val="FF0000"/>
-          <w:sz w:val="28"/>
-          <w:szCs w:val="28"/>
-        </w:rPr>
-        <w:t>поддерживаемость</w:t>
-      </w:r>
-      <w:proofErr w:type="spellEnd"/>
-      <w:r>
-        <w:rPr>
-          <w:rFonts w:ascii="Times New Roman" w:hAnsi="Times New Roman" w:cs="Times New Roman"/>
-          <w:color w:val="FF0000"/>
-          <w:sz w:val="28"/>
-          <w:szCs w:val="28"/>
-        </w:rPr>
-        <w:t xml:space="preserve"> и независимое масштабирование компонентов. Для взаимодействия между </w:t>
-      </w:r>
-      <w:proofErr w:type="spellStart"/>
-      <w:r>
-        <w:rPr>
-          <w:rFonts w:ascii="Times New Roman" w:hAnsi="Times New Roman" w:cs="Times New Roman"/>
-          <w:color w:val="FF0000"/>
+          <w:sz w:val="28"/>
+          <w:szCs w:val="28"/>
+        </w:rPr>
+        <w:t xml:space="preserve"> архитектуре, что обеспечивает высокую гибкость</w:t>
+      </w:r>
+      <w:r>
+        <w:rPr>
+          <w:rFonts w:ascii="Times New Roman" w:hAnsi="Times New Roman" w:cs="Times New Roman"/>
+          <w:sz w:val="28"/>
+          <w:szCs w:val="28"/>
+        </w:rPr>
+        <w:t xml:space="preserve"> и </w:t>
+      </w:r>
+      <w:r>
+        <w:rPr>
+          <w:rFonts w:ascii="Times New Roman" w:hAnsi="Times New Roman" w:cs="Times New Roman"/>
+          <w:sz w:val="28"/>
+          <w:szCs w:val="28"/>
+        </w:rPr>
+        <w:t xml:space="preserve">независимое масштабирование компонентов. Для взаимодействия между </w:t>
+      </w:r>
+      <w:r>
+        <w:rPr>
+          <w:rFonts w:ascii="Times New Roman" w:hAnsi="Times New Roman" w:cs="Times New Roman"/>
           <w:sz w:val="28"/>
           <w:szCs w:val="28"/>
         </w:rPr>
         <w:t>микросервисами</w:t>
       </w:r>
-      <w:proofErr w:type="spellEnd"/>
-      <w:r>
-        <w:rPr>
-          <w:rFonts w:ascii="Times New Roman" w:hAnsi="Times New Roman" w:cs="Times New Roman"/>
-          <w:color w:val="FF0000"/>
-          <w:sz w:val="28"/>
-          <w:szCs w:val="28"/>
-        </w:rPr>
-        <w:t xml:space="preserve"> выбрана событийно-ориентированная архитектура, позволяющая эффективно </w:t>
-      </w:r>
-      <w:r>
-        <w:rPr>
-          <w:rFonts w:ascii="Times New Roman" w:hAnsi="Times New Roman" w:cs="Times New Roman"/>
-          <w:color w:val="FF0000"/>
+      <w:r>
+        <w:rPr>
+          <w:rFonts w:ascii="Times New Roman" w:hAnsi="Times New Roman" w:cs="Times New Roman"/>
+          <w:sz w:val="28"/>
+          <w:szCs w:val="28"/>
+        </w:rPr>
+        <w:t xml:space="preserve"> выбрана событийно-ориентированная архитектура, позволяющая эффективно обрабатывать асинхронные события и </w:t>
+      </w:r>
+      <w:r>
+        <w:rPr>
+          <w:rFonts w:ascii="Times New Roman" w:hAnsi="Times New Roman" w:cs="Times New Roman"/>
           <w:sz w:val="28"/>
           <w:szCs w:val="28"/>
         </w:rPr>
         <w:lastRenderedPageBreak/>
-        <w:t>обрабатывать асинхронные события и обеспечивать слабую связанность компонентов, повышая общую отказоустойчивость системы.</w:t>
+        <w:t>обеспечивать слабую связанность компонентов, повышая общую отказоустойчивость системы.</w:t>
       </w:r>
     </w:p>
     <w:p>
@@ -11147,119 +11290,85 @@
         <w:jc w:val="both"/>
         <w:rPr>
           <w:rFonts w:ascii="Times New Roman" w:hAnsi="Times New Roman" w:cs="Times New Roman"/>
-          <w:color w:val="FF0000"/>
-          <w:sz w:val="28"/>
-          <w:szCs w:val="28"/>
-        </w:rPr>
-      </w:pPr>
-      <w:r>
-        <w:rPr>
-          <w:rFonts w:ascii="Times New Roman" w:hAnsi="Times New Roman" w:cs="Times New Roman"/>
-          <w:color w:val="FF0000"/>
-          <w:sz w:val="28"/>
-          <w:szCs w:val="28"/>
-        </w:rPr>
-        <w:t xml:space="preserve">При выборе подхода для координации распределённых процессов, таких как массовая конвертация предметов по окончании сезона, обновление баланс-метрик и рассылка уведомлений, рассматривались варианты хореографии и </w:t>
+          <w:sz w:val="28"/>
+          <w:szCs w:val="28"/>
+        </w:rPr>
+      </w:pPr>
+      <w:r>
+        <w:rPr>
+          <w:rFonts w:ascii="Times New Roman" w:hAnsi="Times New Roman" w:cs="Times New Roman"/>
+          <w:sz w:val="28"/>
+          <w:szCs w:val="28"/>
+        </w:rPr>
+        <w:t>При выборе подхода для координации распределённых процессов, таких как массовая конвертация предметов по окончании сезона, обновление баланс-метрик и рассылка уведомлений</w:t>
+      </w:r>
+      <w:r>
+        <w:rPr>
+          <w:rFonts w:ascii="Times New Roman" w:hAnsi="Times New Roman" w:cs="Times New Roman"/>
+          <w:sz w:val="28"/>
+          <w:szCs w:val="28"/>
+        </w:rPr>
+        <w:t xml:space="preserve"> была выбрана</w:t>
+      </w:r>
+      <w:r>
+        <w:rPr>
+          <w:rFonts w:ascii="Times New Roman" w:hAnsi="Times New Roman" w:cs="Times New Roman"/>
+          <w:sz w:val="28"/>
+          <w:szCs w:val="28"/>
+        </w:rPr>
+        <w:t xml:space="preserve"> </w:t>
       </w:r>
       <w:proofErr w:type="spellStart"/>
       <w:r>
         <w:rPr>
           <w:rFonts w:ascii="Times New Roman" w:hAnsi="Times New Roman" w:cs="Times New Roman"/>
-          <w:color w:val="FF0000"/>
-          <w:sz w:val="28"/>
-          <w:szCs w:val="28"/>
-        </w:rPr>
-        <w:t>оркестрации</w:t>
+          <w:sz w:val="28"/>
+          <w:szCs w:val="28"/>
+        </w:rPr>
+        <w:t>оркестраци</w:t>
+      </w:r>
+      <w:r>
+        <w:rPr>
+          <w:rFonts w:ascii="Times New Roman" w:hAnsi="Times New Roman" w:cs="Times New Roman"/>
+          <w:sz w:val="28"/>
+          <w:szCs w:val="28"/>
+        </w:rPr>
+        <w:t>я</w:t>
       </w:r>
       <w:proofErr w:type="spellEnd"/>
       <w:r>
         <w:rPr>
           <w:rFonts w:ascii="Times New Roman" w:hAnsi="Times New Roman" w:cs="Times New Roman"/>
-          <w:color w:val="FF0000"/>
-          <w:sz w:val="28"/>
-          <w:szCs w:val="28"/>
-        </w:rPr>
-        <w:t xml:space="preserve">. В пользу </w:t>
+          <w:sz w:val="28"/>
+          <w:szCs w:val="28"/>
+        </w:rPr>
+        <w:t>. Которая дает</w:t>
+      </w:r>
+      <w:r>
+        <w:rPr>
+          <w:rFonts w:ascii="Times New Roman" w:hAnsi="Times New Roman" w:cs="Times New Roman"/>
+          <w:sz w:val="28"/>
+          <w:szCs w:val="28"/>
+        </w:rPr>
+        <w:t xml:space="preserve"> централизованный контроль за сложной последовательностью действий и возможность гарантированного выполнения компенсационных операций в случае ошибок на любом этапе. Для этого применён паттерн </w:t>
       </w:r>
       <w:proofErr w:type="spellStart"/>
       <w:r>
         <w:rPr>
           <w:rFonts w:ascii="Times New Roman" w:hAnsi="Times New Roman" w:cs="Times New Roman"/>
-          <w:color w:val="FF0000"/>
-          <w:sz w:val="28"/>
-          <w:szCs w:val="28"/>
-        </w:rPr>
-        <w:t>оркестрации</w:t>
+          <w:sz w:val="28"/>
+          <w:szCs w:val="28"/>
+        </w:rPr>
+        <w:t>Saga</w:t>
       </w:r>
       <w:proofErr w:type="spellEnd"/>
       <w:r>
         <w:rPr>
           <w:rFonts w:ascii="Times New Roman" w:hAnsi="Times New Roman" w:cs="Times New Roman"/>
-          <w:color w:val="FF0000"/>
-          <w:sz w:val="28"/>
-          <w:szCs w:val="28"/>
-        </w:rPr>
-        <w:t xml:space="preserve"> был выбран централизованный контроль за сложной последовательностью действий и возможность гарантированного выполнения компенсационных операций (компенсирующих транзакций) в случае ошибок на любом этапе. Для этого применён паттерн </w:t>
-      </w:r>
-      <w:proofErr w:type="spellStart"/>
-      <w:r>
-        <w:rPr>
-          <w:rFonts w:ascii="Times New Roman" w:hAnsi="Times New Roman" w:cs="Times New Roman"/>
-          <w:color w:val="FF0000"/>
-          <w:sz w:val="28"/>
-          <w:szCs w:val="28"/>
-        </w:rPr>
-        <w:t>Saga</w:t>
-      </w:r>
-      <w:proofErr w:type="spellEnd"/>
-      <w:r>
-        <w:rPr>
-          <w:rFonts w:ascii="Times New Roman" w:hAnsi="Times New Roman" w:cs="Times New Roman"/>
-          <w:color w:val="FF0000"/>
-          <w:sz w:val="28"/>
-          <w:szCs w:val="28"/>
-        </w:rPr>
-        <w:t>, где центральный сервис-оркестратор (</w:t>
-      </w:r>
-      <w:proofErr w:type="spellStart"/>
-      <w:r>
-        <w:rPr>
-          <w:rFonts w:ascii="Times New Roman" w:hAnsi="Times New Roman" w:cs="Times New Roman"/>
-          <w:color w:val="FF0000"/>
-          <w:sz w:val="28"/>
-          <w:szCs w:val="28"/>
-        </w:rPr>
-        <w:t>Season</w:t>
-      </w:r>
-      <w:proofErr w:type="spellEnd"/>
-      <w:r>
-        <w:rPr>
-          <w:rFonts w:ascii="Times New Roman" w:hAnsi="Times New Roman" w:cs="Times New Roman"/>
-          <w:color w:val="FF0000"/>
-          <w:sz w:val="28"/>
-          <w:szCs w:val="28"/>
-        </w:rPr>
-        <w:t xml:space="preserve"> </w:t>
-      </w:r>
-      <w:proofErr w:type="spellStart"/>
-      <w:r>
-        <w:rPr>
-          <w:rFonts w:ascii="Times New Roman" w:hAnsi="Times New Roman" w:cs="Times New Roman"/>
-          <w:color w:val="FF0000"/>
-          <w:sz w:val="28"/>
-          <w:szCs w:val="28"/>
-        </w:rPr>
-        <w:t>Orchestrator</w:t>
-      </w:r>
-      <w:proofErr w:type="spellEnd"/>
-      <w:r>
-        <w:rPr>
-          <w:rFonts w:ascii="Times New Roman" w:hAnsi="Times New Roman" w:cs="Times New Roman"/>
-          <w:color w:val="FF0000"/>
-          <w:sz w:val="28"/>
-          <w:szCs w:val="28"/>
-        </w:rPr>
-        <w:t>) управляет выполнением распределённого бизнес-процесса, координируя работу специализированных сервисов (правил, конвертации, баланса, уведомлений).</w:t>
+          <w:sz w:val="28"/>
+          <w:szCs w:val="28"/>
+        </w:rPr>
+        <w:t>, где центральный сервис-оркестратор управляет выполнением распределённого бизнес-процесса, координируя работу специализированных сервисов.</w:t>
       </w:r>
     </w:p>
     <w:p>
@@ -11270,119 +11379,69 @@
         <w:jc w:val="both"/>
         <w:rPr>
           <w:rFonts w:ascii="Times New Roman" w:hAnsi="Times New Roman" w:cs="Times New Roman"/>
-          <w:color w:val="FF0000"/>
-          <w:sz w:val="28"/>
-          <w:szCs w:val="28"/>
-        </w:rPr>
-      </w:pPr>
-      <w:r>
-        <w:rPr>
-          <w:rFonts w:ascii="Times New Roman" w:hAnsi="Times New Roman" w:cs="Times New Roman"/>
-          <w:color w:val="FF0000"/>
-          <w:sz w:val="28"/>
-          <w:szCs w:val="28"/>
-        </w:rPr>
-        <w:t xml:space="preserve">Для решения задачи гарантированной доставки событий и поддержания согласованности между транзакциями в базе данных состояний предметов и публикацией событий в брокер сообщений рассматривался </w:t>
+          <w:sz w:val="28"/>
+          <w:szCs w:val="28"/>
+        </w:rPr>
+      </w:pPr>
+      <w:r>
+        <w:rPr>
+          <w:rFonts w:ascii="Times New Roman" w:hAnsi="Times New Roman" w:cs="Times New Roman"/>
+          <w:sz w:val="28"/>
+          <w:szCs w:val="28"/>
+        </w:rPr>
+        <w:t xml:space="preserve">Для решения задачи гарантированной доставки событий и поддержания согласованности между транзакциями в базе данных состояний предметов и публикацией событий в брокер </w:t>
+      </w:r>
+      <w:r>
+        <w:rPr>
+          <w:rFonts w:ascii="Times New Roman" w:hAnsi="Times New Roman" w:cs="Times New Roman"/>
+          <w:sz w:val="28"/>
+          <w:szCs w:val="28"/>
+        </w:rPr>
+        <w:t xml:space="preserve">был </w:t>
+      </w:r>
+      <w:r>
+        <w:rPr>
+          <w:rFonts w:ascii="Times New Roman" w:hAnsi="Times New Roman" w:cs="Times New Roman"/>
+          <w:sz w:val="28"/>
+          <w:szCs w:val="28"/>
+        </w:rPr>
+        <w:t xml:space="preserve">выбран </w:t>
       </w:r>
       <w:proofErr w:type="spellStart"/>
       <w:r>
         <w:rPr>
           <w:rFonts w:ascii="Times New Roman" w:hAnsi="Times New Roman" w:cs="Times New Roman"/>
-          <w:color w:val="FF0000"/>
-          <w:sz w:val="28"/>
-          <w:szCs w:val="28"/>
-        </w:rPr>
-        <w:t>Outbox</w:t>
+          <w:sz w:val="28"/>
+          <w:szCs w:val="28"/>
+        </w:rPr>
+        <w:t>Debezium</w:t>
       </w:r>
       <w:proofErr w:type="spellEnd"/>
       <w:r>
         <w:rPr>
           <w:rFonts w:ascii="Times New Roman" w:hAnsi="Times New Roman" w:cs="Times New Roman"/>
-          <w:color w:val="FF0000"/>
-          <w:sz w:val="28"/>
-          <w:szCs w:val="28"/>
-        </w:rPr>
-        <w:t xml:space="preserve">-паттерн. Однако его прямое использование может создавать сложности при высокой нагрузке и в условиях множества инстансов сервисов. В качестве более надежного и практичного решения для данной предметной области выбран </w:t>
+          <w:sz w:val="28"/>
+          <w:szCs w:val="28"/>
+        </w:rPr>
+        <w:t xml:space="preserve"> </w:t>
       </w:r>
       <w:proofErr w:type="spellStart"/>
       <w:r>
         <w:rPr>
           <w:rFonts w:ascii="Times New Roman" w:hAnsi="Times New Roman" w:cs="Times New Roman"/>
-          <w:color w:val="FF0000"/>
-          <w:sz w:val="28"/>
-          <w:szCs w:val="28"/>
-        </w:rPr>
-        <w:t>Debezium</w:t>
+          <w:sz w:val="28"/>
+          <w:szCs w:val="28"/>
+        </w:rPr>
+        <w:t>Connector</w:t>
       </w:r>
       <w:proofErr w:type="spellEnd"/>
       <w:r>
         <w:rPr>
           <w:rFonts w:ascii="Times New Roman" w:hAnsi="Times New Roman" w:cs="Times New Roman"/>
-          <w:color w:val="FF0000"/>
-          <w:sz w:val="28"/>
-          <w:szCs w:val="28"/>
-        </w:rPr>
-        <w:t xml:space="preserve"> </w:t>
-      </w:r>
-      <w:proofErr w:type="spellStart"/>
-      <w:r>
-        <w:rPr>
-          <w:rFonts w:ascii="Times New Roman" w:hAnsi="Times New Roman" w:cs="Times New Roman"/>
-          <w:color w:val="FF0000"/>
-          <w:sz w:val="28"/>
-          <w:szCs w:val="28"/>
-        </w:rPr>
-        <w:t>Connector</w:t>
-      </w:r>
-      <w:proofErr w:type="spellEnd"/>
-      <w:r>
-        <w:rPr>
-          <w:rFonts w:ascii="Times New Roman" w:hAnsi="Times New Roman" w:cs="Times New Roman"/>
-          <w:color w:val="FF0000"/>
-          <w:sz w:val="28"/>
-          <w:szCs w:val="28"/>
-        </w:rPr>
-        <w:t xml:space="preserve">, который обеспечивает отслеживание изменений в журнале транзакций базы данных (CDC — Change Data </w:t>
-      </w:r>
-      <w:proofErr w:type="spellStart"/>
-      <w:r>
-        <w:rPr>
-          <w:rFonts w:ascii="Times New Roman" w:hAnsi="Times New Roman" w:cs="Times New Roman"/>
-          <w:color w:val="FF0000"/>
-          <w:sz w:val="28"/>
-          <w:szCs w:val="28"/>
-        </w:rPr>
-        <w:t>Capture</w:t>
-      </w:r>
-      <w:proofErr w:type="spellEnd"/>
-      <w:r>
-        <w:rPr>
-          <w:rFonts w:ascii="Times New Roman" w:hAnsi="Times New Roman" w:cs="Times New Roman"/>
-          <w:color w:val="FF0000"/>
-          <w:sz w:val="28"/>
-          <w:szCs w:val="28"/>
-        </w:rPr>
-        <w:t xml:space="preserve">) и автоматическую публикацию соответствующих событий в шину сообщений (например, </w:t>
-      </w:r>
-      <w:proofErr w:type="spellStart"/>
-      <w:r>
-        <w:rPr>
-          <w:rFonts w:ascii="Times New Roman" w:hAnsi="Times New Roman" w:cs="Times New Roman"/>
-          <w:color w:val="FF0000"/>
-          <w:sz w:val="28"/>
-          <w:szCs w:val="28"/>
-        </w:rPr>
-        <w:t>Kafka</w:t>
-      </w:r>
-      <w:proofErr w:type="spellEnd"/>
-      <w:r>
-        <w:rPr>
-          <w:rFonts w:ascii="Times New Roman" w:hAnsi="Times New Roman" w:cs="Times New Roman"/>
-          <w:color w:val="FF0000"/>
-          <w:sz w:val="28"/>
-          <w:szCs w:val="28"/>
-        </w:rPr>
-        <w:t>). Это гарантирует, что ни одно изменение состояния предмета не будет потеряно и будет обработано соответствующими подписчиками.</w:t>
+          <w:sz w:val="28"/>
+          <w:szCs w:val="28"/>
+        </w:rPr>
+        <w:t>, который обеспечивает отслеживание изменений в журнале транзакций базы данных и автоматическую публикацию соответствующих событий. Это гарантирует, что ни одно изменение состояния предмета не будет потеряно и будет обработано.</w:t>
       </w:r>
     </w:p>
     <w:p>
@@ -11393,15 +11452,13 @@
         <w:jc w:val="both"/>
         <w:rPr>
           <w:rFonts w:ascii="Times New Roman" w:hAnsi="Times New Roman" w:cs="Times New Roman"/>
-          <w:color w:val="FF0000"/>
-          <w:sz w:val="28"/>
-          <w:szCs w:val="28"/>
-        </w:rPr>
-      </w:pPr>
-      <w:r>
-        <w:rPr>
-          <w:rFonts w:ascii="Times New Roman" w:hAnsi="Times New Roman" w:cs="Times New Roman"/>
-          <w:color w:val="FF0000"/>
+          <w:sz w:val="28"/>
+          <w:szCs w:val="28"/>
+        </w:rPr>
+      </w:pPr>
+      <w:r>
+        <w:rPr>
+          <w:rFonts w:ascii="Times New Roman" w:hAnsi="Times New Roman" w:cs="Times New Roman"/>
           <w:sz w:val="28"/>
           <w:szCs w:val="28"/>
         </w:rPr>
@@ -11411,7 +11468,6 @@
       <w:r>
         <w:rPr>
           <w:rFonts w:ascii="Times New Roman" w:hAnsi="Times New Roman" w:cs="Times New Roman"/>
-          <w:color w:val="FF0000"/>
           <w:sz w:val="28"/>
           <w:szCs w:val="28"/>
         </w:rPr>
@@ -11421,71 +11477,42 @@
       <w:r>
         <w:rPr>
           <w:rFonts w:ascii="Times New Roman" w:hAnsi="Times New Roman" w:cs="Times New Roman"/>
-          <w:color w:val="FF0000"/>
-          <w:sz w:val="28"/>
-          <w:szCs w:val="28"/>
-        </w:rPr>
-        <w:t xml:space="preserve">-диаграмма, включающая уровни </w:t>
-      </w:r>
-      <w:proofErr w:type="spellStart"/>
-      <w:r>
-        <w:rPr>
-          <w:rFonts w:ascii="Times New Roman" w:hAnsi="Times New Roman" w:cs="Times New Roman"/>
-          <w:color w:val="FF0000"/>
-          <w:sz w:val="28"/>
-          <w:szCs w:val="28"/>
-        </w:rPr>
-        <w:t>Motivation</w:t>
-      </w:r>
-      <w:proofErr w:type="spellEnd"/>
-      <w:r>
-        <w:rPr>
-          <w:rFonts w:ascii="Times New Roman" w:hAnsi="Times New Roman" w:cs="Times New Roman"/>
-          <w:color w:val="FF0000"/>
-          <w:sz w:val="28"/>
-          <w:szCs w:val="28"/>
-        </w:rPr>
-        <w:t xml:space="preserve"> (Цели), Business (Бизнес-процессы), Application (Прикладные сервисы), Technology (Технологии) и </w:t>
-      </w:r>
-      <w:proofErr w:type="spellStart"/>
-      <w:r>
-        <w:rPr>
-          <w:rFonts w:ascii="Times New Roman" w:hAnsi="Times New Roman" w:cs="Times New Roman"/>
-          <w:color w:val="FF0000"/>
-          <w:sz w:val="28"/>
-          <w:szCs w:val="28"/>
-        </w:rPr>
-        <w:t>Implementation</w:t>
-      </w:r>
-      <w:proofErr w:type="spellEnd"/>
-      <w:r>
-        <w:rPr>
-          <w:rFonts w:ascii="Times New Roman" w:hAnsi="Times New Roman" w:cs="Times New Roman"/>
-          <w:color w:val="FF0000"/>
-          <w:sz w:val="28"/>
-          <w:szCs w:val="28"/>
-        </w:rPr>
-        <w:t xml:space="preserve"> &amp; </w:t>
-      </w:r>
-      <w:proofErr w:type="spellStart"/>
-      <w:r>
-        <w:rPr>
-          <w:rFonts w:ascii="Times New Roman" w:hAnsi="Times New Roman" w:cs="Times New Roman"/>
-          <w:color w:val="FF0000"/>
-          <w:sz w:val="28"/>
-          <w:szCs w:val="28"/>
-        </w:rPr>
-        <w:t>Migration</w:t>
-      </w:r>
-      <w:proofErr w:type="spellEnd"/>
-      <w:r>
-        <w:rPr>
-          <w:rFonts w:ascii="Times New Roman" w:hAnsi="Times New Roman" w:cs="Times New Roman"/>
-          <w:color w:val="FF0000"/>
-          <w:sz w:val="28"/>
-          <w:szCs w:val="28"/>
-        </w:rPr>
-        <w:t xml:space="preserve"> (Внедрение). Это позволяет наглядно представить все компоненты системы, их взаимосвязи, а также стратегию и этапы реализации (рисунок 15).</w:t>
+          <w:sz w:val="28"/>
+          <w:szCs w:val="28"/>
+        </w:rPr>
+        <w:t>-диаграмма</w:t>
+      </w:r>
+      <w:r>
+        <w:rPr>
+          <w:rFonts w:ascii="Times New Roman" w:hAnsi="Times New Roman" w:cs="Times New Roman"/>
+          <w:sz w:val="28"/>
+          <w:szCs w:val="28"/>
+        </w:rPr>
+        <w:t>.</w:t>
+      </w:r>
+      <w:r>
+        <w:rPr>
+          <w:rFonts w:ascii="Times New Roman" w:hAnsi="Times New Roman" w:cs="Times New Roman"/>
+          <w:sz w:val="28"/>
+          <w:szCs w:val="28"/>
+        </w:rPr>
+        <w:t xml:space="preserve"> </w:t>
+      </w:r>
+      <w:r>
+        <w:rPr>
+          <w:rFonts w:ascii="Times New Roman" w:hAnsi="Times New Roman" w:cs="Times New Roman"/>
+          <w:sz w:val="28"/>
+          <w:szCs w:val="28"/>
+        </w:rPr>
+        <w:t xml:space="preserve">Которая </w:t>
+      </w:r>
+      <w:r>
+        <w:rPr>
+          <w:rFonts w:ascii="Times New Roman" w:hAnsi="Times New Roman" w:cs="Times New Roman"/>
+          <w:sz w:val="28"/>
+          <w:szCs w:val="28"/>
+        </w:rPr>
+        <w:t>позволяет наглядно представить все компоненты системы, их взаимосвязи (рисунок 15).</w:t>
       </w:r>
     </w:p>
     <w:p>
@@ -11508,7 +11535,6 @@
           <w:szCs w:val="28"/>
           <w:lang w:val="en-US"/>
         </w:rPr>
-        <w:lastRenderedPageBreak/>
         <w:drawing>
           <wp:inline distT="0" distB="0" distL="0" distR="0" wp14:anchorId="46F7D809" wp14:editId="2D27A5CA">
             <wp:extent cx="5400000" cy="3085714"/>
@@ -11597,37 +11623,14 @@
         </w:rPr>
         <w:t xml:space="preserve"> </w:t>
       </w:r>
-      <w:proofErr w:type="spellStart"/>
-      <w:r>
-        <w:rPr>
-          <w:rFonts w:ascii="Times New Roman" w:hAnsi="Times New Roman" w:cs="Times New Roman"/>
-          <w:sz w:val="28"/>
-          <w:szCs w:val="28"/>
-        </w:rPr>
-        <w:t>Diagram</w:t>
-      </w:r>
-      <w:proofErr w:type="spellEnd"/>
-      <w:r>
-        <w:rPr>
-          <w:rFonts w:ascii="Times New Roman" w:hAnsi="Times New Roman" w:cs="Times New Roman"/>
-          <w:sz w:val="28"/>
-          <w:szCs w:val="28"/>
-        </w:rPr>
-        <w:t xml:space="preserve"> (Архитектурная диаграмма)</w:t>
-      </w:r>
-    </w:p>
-    <w:p>
-      <w:pPr>
-        <w:pStyle w:val="a7"/>
-        <w:spacing w:after="0" w:line="240" w:lineRule="auto"/>
-        <w:ind w:left="0" w:firstLine="709"/>
-        <w:jc w:val="center"/>
-        <w:rPr>
-          <w:rFonts w:ascii="Times New Roman" w:hAnsi="Times New Roman" w:cs="Times New Roman"/>
-          <w:sz w:val="28"/>
-          <w:szCs w:val="28"/>
-        </w:rPr>
-      </w:pPr>
+      <w:r>
+        <w:rPr>
+          <w:rFonts w:ascii="Times New Roman" w:hAnsi="Times New Roman" w:cs="Times New Roman"/>
+          <w:sz w:val="28"/>
+          <w:szCs w:val="28"/>
+        </w:rPr>
+        <w:t>диаграмма</w:t>
+      </w:r>
     </w:p>
     <w:p>
       <w:pPr>
@@ -11654,6 +11657,7 @@
           <w:sz w:val="28"/>
           <w:szCs w:val="28"/>
         </w:rPr>
+        <w:lastRenderedPageBreak/>
         <w:t>Выводы и результаты к разделу 2</w:t>
       </w:r>
       <w:bookmarkEnd w:id="18"/>
@@ -11892,25 +11896,7 @@
           <w:sz w:val="28"/>
           <w:szCs w:val="28"/>
         </w:rPr>
-        <w:t xml:space="preserve">создана архитектура с использованием </w:t>
-      </w:r>
-      <w:proofErr w:type="spellStart"/>
-      <w:r>
-        <w:rPr>
-          <w:rFonts w:ascii="Times New Roman" w:hAnsi="Times New Roman" w:cs="Times New Roman"/>
-          <w:sz w:val="28"/>
-          <w:szCs w:val="28"/>
-        </w:rPr>
-        <w:t>микросервисного</w:t>
-      </w:r>
-      <w:proofErr w:type="spellEnd"/>
-      <w:r>
-        <w:rPr>
-          <w:rFonts w:ascii="Times New Roman" w:hAnsi="Times New Roman" w:cs="Times New Roman"/>
-          <w:sz w:val="28"/>
-          <w:szCs w:val="28"/>
-        </w:rPr>
-        <w:t xml:space="preserve"> подхода;  </w:t>
+        <w:t xml:space="preserve">создана архитектура с использованием микросервисного подхода;  </w:t>
       </w:r>
     </w:p>
     <w:p>
@@ -12301,25 +12287,7 @@
           <w:sz w:val="28"/>
           <w:szCs w:val="28"/>
         </w:rPr>
-        <w:t xml:space="preserve">: как не растерять сообщения в </w:t>
-      </w:r>
-      <w:proofErr w:type="spellStart"/>
-      <w:r>
-        <w:rPr>
-          <w:rFonts w:ascii="Times New Roman" w:hAnsi="Times New Roman" w:cs="Times New Roman"/>
-          <w:sz w:val="28"/>
-          <w:szCs w:val="28"/>
-        </w:rPr>
-        <w:t>микросервисной</w:t>
-      </w:r>
-      <w:proofErr w:type="spellEnd"/>
-      <w:r>
-        <w:rPr>
-          <w:rFonts w:ascii="Times New Roman" w:hAnsi="Times New Roman" w:cs="Times New Roman"/>
-          <w:sz w:val="28"/>
-          <w:szCs w:val="28"/>
-        </w:rPr>
-        <w:t xml:space="preserve"> архитектуре – Режим доступа: </w:t>
+        <w:t xml:space="preserve">: как не растерять сообщения в микросервисной архитектуре – Режим доступа: </w:t>
       </w:r>
       <w:hyperlink r:id="rId20" w:history="1">
         <w:r>
@@ -12608,25 +12576,7 @@
           <w:sz w:val="28"/>
           <w:szCs w:val="28"/>
         </w:rPr>
-        <w:t xml:space="preserve"> [Электронный ресурс]. </w:t>
-      </w:r>
-      <w:proofErr w:type="spellStart"/>
-      <w:r>
-        <w:rPr>
-          <w:rFonts w:ascii="Times New Roman" w:hAnsi="Times New Roman" w:cs="Times New Roman"/>
-          <w:sz w:val="28"/>
-          <w:szCs w:val="28"/>
-        </w:rPr>
-        <w:t>Микросервисы</w:t>
-      </w:r>
-      <w:proofErr w:type="spellEnd"/>
-      <w:r>
-        <w:rPr>
-          <w:rFonts w:ascii="Times New Roman" w:hAnsi="Times New Roman" w:cs="Times New Roman"/>
-          <w:sz w:val="28"/>
-          <w:szCs w:val="28"/>
-        </w:rPr>
-        <w:t xml:space="preserve"> и данные</w:t>
+        <w:t xml:space="preserve"> [Электронный ресурс]. Микросервисы и данные</w:t>
       </w:r>
       <w:proofErr w:type="gramStart"/>
       <w:r>
@@ -12977,7 +12927,7 @@
 </file>
 
 <file path=word/numbering.xml><?xml version="1.0" encoding="utf-8"?>
-<w:numbering xmlns:wpc="http://schemas.microsoft.com/office/word/2010/wordprocessingCanvas" xmlns:cx="http://schemas.microsoft.com/office/drawing/2014/chartex" xmlns:cx1="http://schemas.microsoft.com/office/drawing/2015/9/8/chartex" xmlns:cx2="http://schemas.microsoft.com/office/drawing/2015/10/21/chartex" xmlns:cx3="http://schemas.microsoft.com/office/drawing/2016/5/9/chartex" xmlns:cx4="http://schemas.microsoft.com/office/drawing/2016/5/10/chartex" xmlns:cx5="http://schemas.microsoft.com/office/drawing/2016/5/11/chartex" xmlns:cx6="http://schemas.microsoft.com/office/drawing/2016/5/12/chartex" xmlns:cx7="http://schemas.microsoft.com/office/drawing/2016/5/13/chartex" xmlns:cx8="http://schemas.microsoft.com/office/drawing/2016/5/14/chartex" xmlns:mc="http://schemas.openxmlformats.org/markup-compatibility/2006" xmlns:aink="http://schemas.microsoft.com/office/drawing/2016/ink" xmlns:am3d="http://schemas.microsoft.com/office/drawing/2017/model3d" xmlns:o="urn:schemas-microsoft-com:office:office" xmlns:oel="http://schemas.microsoft.com/office/2019/extlst" xmlns:r="http://schemas.openxmlformats.org/officeDocument/2006/relationships" xmlns:m="http://schemas.openxmlformats.org/officeDocument/2006/math" xmlns:v="urn:schemas-microsoft-com:vml" xmlns:wp14="http://schemas.microsoft.com/office/word/2010/wordprocessingDrawing" xmlns:wp="http://schemas.openxmlformats.org/drawingml/2006/wordprocessingDrawing" xmlns:w10="urn:schemas-microsoft-com:office:word" xmlns:w="http://schemas.openxmlformats.org/wordprocessingml/2006/main" xmlns:w14="http://schemas.microsoft.com/office/word/2010/wordml" xmlns:w15="http://schemas.microsoft.com/office/word/2012/wordml" xmlns:w16cex="http://schemas.microsoft.com/office/word/2018/wordml/cex" xmlns:w16cid="http://schemas.microsoft.com/office/word/2016/wordml/cid" xmlns:w16="http://schemas.microsoft.com/office/word/2018/wordml" xmlns:w16sdtdh="http://schemas.microsoft.com/office/word/2020/wordml/sdtdatahash" xmlns:w16se="http://schemas.microsoft.com/office/word/2015/wordml/symex" xmlns:wpg="http://schemas.microsoft.com/office/word/2010/wordprocessingGroup" xmlns:wpi="http://schemas.microsoft.com/office/word/2010/wordprocessingInk" xmlns:wne="http://schemas.microsoft.com/office/word/2006/wordml" xmlns:wps="http://schemas.microsoft.com/office/word/2010/wordprocessingShape" mc:Ignorable="w14 w15 w16se w16cid w16 w16cex w16sdtdh wp14">
+<w:numbering xmlns:wpc="http://schemas.microsoft.com/office/word/2010/wordprocessingCanvas" xmlns:cx="http://schemas.microsoft.com/office/drawing/2014/chartex" xmlns:cx1="http://schemas.microsoft.com/office/drawing/2015/9/8/chartex" xmlns:cx2="http://schemas.microsoft.com/office/drawing/2015/10/21/chartex" xmlns:cx3="http://schemas.microsoft.com/office/drawing/2016/5/9/chartex" xmlns:cx4="http://schemas.microsoft.com/office/drawing/2016/5/10/chartex" xmlns:cx5="http://schemas.microsoft.com/office/drawing/2016/5/11/chartex" xmlns:cx6="http://schemas.microsoft.com/office/drawing/2016/5/12/chartex" xmlns:cx7="http://schemas.microsoft.com/office/drawing/2016/5/13/chartex" xmlns:cx8="http://schemas.microsoft.com/office/drawing/2016/5/14/chartex" xmlns:mc="http://schemas.openxmlformats.org/markup-compatibility/2006" xmlns:aink="http://schemas.microsoft.com/office/drawing/2016/ink" xmlns:am3d="http://schemas.microsoft.com/office/drawing/2017/model3d" xmlns:o="urn:schemas-microsoft-com:office:office" xmlns:oel="http://schemas.microsoft.com/office/2019/extlst" xmlns:r="http://schemas.openxmlformats.org/officeDocument/2006/relationships" xmlns:m="http://schemas.openxmlformats.org/officeDocument/2006/math" xmlns:v="urn:schemas-microsoft-com:vml" xmlns:wp14="http://schemas.microsoft.com/office/word/2010/wordprocessingDrawing" xmlns:wp="http://schemas.openxmlformats.org/drawingml/2006/wordprocessingDrawing" xmlns:w10="urn:schemas-microsoft-com:office:word" xmlns:w="http://schemas.openxmlformats.org/wordprocessingml/2006/main" xmlns:w14="http://schemas.microsoft.com/office/word/2010/wordml" xmlns:w15="http://schemas.microsoft.com/office/word/2012/wordml" xmlns:w16cex="http://schemas.microsoft.com/office/word/2018/wordml/cex" xmlns:w16cid="http://schemas.microsoft.com/office/word/2016/wordml/cid" xmlns:w16="http://schemas.microsoft.com/office/word/2018/wordml" xmlns:w16du="http://schemas.microsoft.com/office/word/2023/wordml/word16du" xmlns:w16sdtdh="http://schemas.microsoft.com/office/word/2020/wordml/sdtdatahash" xmlns:w16sdtfl="http://schemas.microsoft.com/office/word/2024/wordml/sdtformatlock" xmlns:w16se="http://schemas.microsoft.com/office/word/2015/wordml/symex" xmlns:wpg="http://schemas.microsoft.com/office/word/2010/wordprocessingGroup" xmlns:wpi="http://schemas.microsoft.com/office/word/2010/wordprocessingInk" xmlns:wne="http://schemas.microsoft.com/office/word/2006/wordml" xmlns:wps="http://schemas.microsoft.com/office/word/2010/wordprocessingShape" mc:Ignorable="w14 w15 w16se w16cid w16 w16cex w16sdtdh w16sdtfl w16du wp14">
   <w:abstractNum w:abstractNumId="0" w15:restartNumberingAfterBreak="0">
     <w:nsid w:val="05B64213"/>
     <w:multiLevelType w:val="hybridMultilevel"/>
@@ -17810,7 +17760,7 @@
 </file>
 
 <file path=word/styles.xml><?xml version="1.0" encoding="utf-8"?>
-<w:styles xmlns:mc="http://schemas.openxmlformats.org/markup-compatibility/2006" xmlns:r="http://schemas.openxmlformats.org/officeDocument/2006/relationships" xmlns:w="http://schemas.openxmlformats.org/wordprocessingml/2006/main" xmlns:w14="http://schemas.microsoft.com/office/word/2010/wordml" xmlns:w15="http://schemas.microsoft.com/office/word/2012/wordml" xmlns:w16cex="http://schemas.microsoft.com/office/word/2018/wordml/cex" xmlns:w16cid="http://schemas.microsoft.com/office/word/2016/wordml/cid" xmlns:w16="http://schemas.microsoft.com/office/word/2018/wordml" xmlns:w16sdtdh="http://schemas.microsoft.com/office/word/2020/wordml/sdtdatahash" xmlns:w16se="http://schemas.microsoft.com/office/word/2015/wordml/symex" mc:Ignorable="w14 w15 w16se w16cid w16 w16cex w16sdtdh">
+<w:styles xmlns:mc="http://schemas.openxmlformats.org/markup-compatibility/2006" xmlns:r="http://schemas.openxmlformats.org/officeDocument/2006/relationships" xmlns:w="http://schemas.openxmlformats.org/wordprocessingml/2006/main" xmlns:w14="http://schemas.microsoft.com/office/word/2010/wordml" xmlns:w15="http://schemas.microsoft.com/office/word/2012/wordml" xmlns:w16cex="http://schemas.microsoft.com/office/word/2018/wordml/cex" xmlns:w16cid="http://schemas.microsoft.com/office/word/2016/wordml/cid" xmlns:w16="http://schemas.microsoft.com/office/word/2018/wordml" xmlns:w16du="http://schemas.microsoft.com/office/word/2023/wordml/word16du" xmlns:w16sdtdh="http://schemas.microsoft.com/office/word/2020/wordml/sdtdatahash" xmlns:w16sdtfl="http://schemas.microsoft.com/office/word/2024/wordml/sdtformatlock" xmlns:w16se="http://schemas.microsoft.com/office/word/2015/wordml/symex" mc:Ignorable="w14 w15 w16se w16cid w16 w16cex w16sdtdh w16sdtfl w16du">
   <w:docDefaults>
     <w:rPrDefault>
       <w:rPr>

</xml_diff>